<commit_message>
docs(catalog): regenerate rendered + docx after bundle-component addition
Co-Authored-By: Claude Opus 4.8 <noreply@anthropic.com>
Claude-Session: https://claude.ai/code/session_01RwtMRFwzHC7G5CTnGLhgKu
</commit_message>
<xml_diff>
--- a/docs/as-built/docx/catalog.docx
+++ b/docs/as-built/docx/catalog.docx
@@ -2,7 +2,7 @@
 <file path=word/document.xml><?xml version="1.0" encoding="utf-8"?>
 <w:document xmlns:w="http://schemas.openxmlformats.org/wordprocessingml/2006/main" xmlns:m="http://schemas.openxmlformats.org/officeDocument/2006/math" xmlns:r="http://schemas.openxmlformats.org/officeDocument/2006/relationships" xmlns:o="urn:schemas-microsoft-com:office:office" xmlns:v="urn:schemas-microsoft-com:vml" xmlns:w10="urn:schemas-microsoft-com:office:word" xmlns:a="http://schemas.openxmlformats.org/drawingml/2006/main" xmlns:pic="http://schemas.openxmlformats.org/drawingml/2006/picture" xmlns:wp="http://schemas.openxmlformats.org/drawingml/2006/wordprocessingDrawing">
   <w:body>
-    <w:bookmarkStart w:id="75" w:name="Xbb2fb51547c41f50016debab311eb65fb10a2c6"/>
+    <w:bookmarkStart w:id="76" w:name="Xbb2fb51547c41f50016debab311eb65fb10a2c6"/>
     <w:p>
       <w:pPr>
         <w:pStyle w:val="Heading1"/>
@@ -1011,7 +1011,7 @@
               <a:graphicData uri="http://schemas.openxmlformats.org/drawingml/2006/picture">
                 <pic:pic>
                   <pic:nvPicPr>
-                    <pic:cNvPr descr="/tmp/docximg-dY8fbM/catalog_md_1.png" id="23" name="Picture"/>
+                    <pic:cNvPr descr="/tmp/docximg-cqvIrc/catalog_md_1.png" id="23" name="Picture"/>
                     <pic:cNvPicPr>
                       <a:picLocks noChangeArrowheads="1" noChangeAspect="1"/>
                     </pic:cNvPicPr>
@@ -1066,7 +1066,7 @@
               <a:graphicData uri="http://schemas.openxmlformats.org/drawingml/2006/picture">
                 <pic:pic>
                   <pic:nvPicPr>
-                    <pic:cNvPr descr="/tmp/docximg-dY8fbM/catalog_md_2.png" id="26" name="Picture"/>
+                    <pic:cNvPr descr="/tmp/docximg-cqvIrc/catalog_md_2.png" id="26" name="Picture"/>
                     <pic:cNvPicPr>
                       <a:picLocks noChangeArrowheads="1" noChangeAspect="1"/>
                     </pic:cNvPicPr>
@@ -1750,7 +1750,7 @@
               <a:graphicData uri="http://schemas.openxmlformats.org/drawingml/2006/picture">
                 <pic:pic>
                   <pic:nvPicPr>
-                    <pic:cNvPr descr="/tmp/docximg-dY8fbM/catalog_md_3.png" id="31" name="Picture"/>
+                    <pic:cNvPr descr="/tmp/docximg-cqvIrc/catalog_md_3.png" id="31" name="Picture"/>
                     <pic:cNvPicPr>
                       <a:picLocks noChangeArrowheads="1" noChangeAspect="1"/>
                     </pic:cNvPicPr>
@@ -2381,7 +2381,7 @@
               <a:graphicData uri="http://schemas.openxmlformats.org/drawingml/2006/picture">
                 <pic:pic>
                   <pic:nvPicPr>
-                    <pic:cNvPr descr="/tmp/docximg-dY8fbM/catalog_md_4.png" id="36" name="Picture"/>
+                    <pic:cNvPr descr="/tmp/docximg-cqvIrc/catalog_md_4.png" id="36" name="Picture"/>
                     <pic:cNvPicPr>
                       <a:picLocks noChangeArrowheads="1" noChangeAspect="1"/>
                     </pic:cNvPicPr>
@@ -2870,7 +2870,7 @@
               <a:graphicData uri="http://schemas.openxmlformats.org/drawingml/2006/picture">
                 <pic:pic>
                   <pic:nvPicPr>
-                    <pic:cNvPr descr="/tmp/docximg-dY8fbM/catalog_md_5.png" id="40" name="Picture"/>
+                    <pic:cNvPr descr="/tmp/docximg-cqvIrc/catalog_md_5.png" id="40" name="Picture"/>
                     <pic:cNvPicPr>
                       <a:picLocks noChangeArrowheads="1" noChangeAspect="1"/>
                     </pic:cNvPicPr>
@@ -3073,7 +3073,7 @@
               <a:graphicData uri="http://schemas.openxmlformats.org/drawingml/2006/picture">
                 <pic:pic>
                   <pic:nvPicPr>
-                    <pic:cNvPr descr="/tmp/docximg-dY8fbM/catalog_md_6.png" id="44" name="Picture"/>
+                    <pic:cNvPr descr="/tmp/docximg-cqvIrc/catalog_md_6.png" id="44" name="Picture"/>
                     <pic:cNvPicPr>
                       <a:picLocks noChangeArrowheads="1" noChangeAspect="1"/>
                     </pic:cNvPicPr>
@@ -3324,7 +3324,7 @@
     </w:p>
     <w:bookmarkEnd w:id="47"/>
     <w:bookmarkEnd w:id="48"/>
-    <w:bookmarkStart w:id="66" w:name="Xa9e563dc3b35f6ef3588b217c42e71c7f9d18b0"/>
+    <w:bookmarkStart w:id="67" w:name="Xa9e563dc3b35f6ef3588b217c42e71c7f9d18b0"/>
     <w:p>
       <w:pPr>
         <w:pStyle w:val="Heading2"/>
@@ -6347,7 +6347,7 @@
               <a:graphicData uri="http://schemas.openxmlformats.org/drawingml/2006/picture">
                 <pic:pic>
                   <pic:nvPicPr>
-                    <pic:cNvPr descr="/tmp/docximg-dY8fbM/catalog_md_7.png" id="51" name="Picture"/>
+                    <pic:cNvPr descr="/tmp/docximg-cqvIrc/catalog_md_7.png" id="51" name="Picture"/>
                     <pic:cNvPicPr>
                       <a:picLocks noChangeArrowheads="1" noChangeAspect="1"/>
                     </pic:cNvPicPr>
@@ -6427,7 +6427,7 @@
               <a:graphicData uri="http://schemas.openxmlformats.org/drawingml/2006/picture">
                 <pic:pic>
                   <pic:nvPicPr>
-                    <pic:cNvPr descr="/tmp/docximg-dY8fbM/catalog_md_8.png" id="54" name="Picture"/>
+                    <pic:cNvPr descr="/tmp/docximg-cqvIrc/catalog_md_8.png" id="54" name="Picture"/>
                     <pic:cNvPicPr>
                       <a:picLocks noChangeArrowheads="1" noChangeAspect="1"/>
                     </pic:cNvPicPr>
@@ -17324,7 +17324,7 @@
               <a:graphicData uri="http://schemas.openxmlformats.org/drawingml/2006/picture">
                 <pic:pic>
                   <pic:nvPicPr>
-                    <pic:cNvPr descr="/tmp/docximg-dY8fbM/catalog_md_9.png" id="61" name="Picture"/>
+                    <pic:cNvPr descr="/tmp/docximg-cqvIrc/catalog_md_9.png" id="61" name="Picture"/>
                     <pic:cNvPicPr>
                       <a:picLocks noChangeArrowheads="1" noChangeAspect="1"/>
                     </pic:cNvPicPr>
@@ -28867,7 +28867,7 @@
         <w:pStyle w:val="Compact"/>
       </w:pPr>
       <w:r>
-        <w:t xml:space="preserve">(Package and channel links live in child tables —</w:t>
+        <w:t xml:space="preserve">(The</w:t>
       </w:r>
       <w:r>
         <w:t xml:space="preserve"> </w:t>
@@ -28882,18 +28882,1173 @@
         <w:t xml:space="preserve"> </w:t>
       </w:r>
       <w:r>
-        <w:t xml:space="preserve">is just the header.)</w:t>
+        <w:t xml:space="preserve">row is just the</w:t>
+      </w:r>
+      <w:r>
+        <w:t xml:space="preserve"> </w:t>
+      </w:r>
+      <w:r>
+        <w:rPr>
+          <w:bCs/>
+          <w:b/>
+        </w:rPr>
+        <w:t xml:space="preserve">header</w:t>
+      </w:r>
+      <w:r>
+        <w:t xml:space="preserve"> </w:t>
+      </w:r>
+      <w:r>
+        <w:t xml:space="preserve">— the packages it contains live in the</w:t>
+      </w:r>
+      <w:r>
+        <w:t xml:space="preserve"> </w:t>
+      </w:r>
+      <w:r>
+        <w:rPr>
+          <w:rStyle w:val="VerbatimChar"/>
+        </w:rPr>
+        <w:t xml:space="preserve">commercial_bundle_component</w:t>
+      </w:r>
+      <w:r>
+        <w:t xml:space="preserve"> </w:t>
+      </w:r>
+      <w:r>
+        <w:t xml:space="preserve">join below; channel/availability, discounts and migration paths live in</w:t>
+      </w:r>
+      <w:r>
+        <w:t xml:space="preserve"> </w:t>
+      </w:r>
+      <w:r>
+        <w:t xml:space="preserve">the other</w:t>
+      </w:r>
+      <w:r>
+        <w:t xml:space="preserve"> </w:t>
+      </w:r>
+      <w:r>
+        <w:rPr>
+          <w:rStyle w:val="VerbatimChar"/>
+        </w:rPr>
+        <w:t xml:space="preserve">commercial_bundle_*</w:t>
+      </w:r>
+      <w:r>
+        <w:t xml:space="preserve"> </w:t>
+      </w:r>
+      <w:r>
+        <w:t xml:space="preserve">child tables.)</w:t>
       </w:r>
     </w:p>
     <w:bookmarkEnd w:id="65"/>
-    <w:bookmarkEnd w:id="66"/>
-    <w:bookmarkStart w:id="67" w:name="Xfb5d98d392a65f9c5ec838f4edf46bff01392c1"/>
+    <w:bookmarkStart w:id="66" w:name="X49bbc6965e3bb1a0ff16e189415abae056bc21d"/>
     <w:p>
       <w:pPr>
-        <w:pStyle w:val="Heading2"/>
+        <w:pStyle w:val="Heading3"/>
       </w:pPr>
       <w:r>
-        <w:t xml:space="preserve">3. Services</w:t>
+        <w:rPr>
+          <w:rStyle w:val="VerbatimChar"/>
+        </w:rPr>
+        <w:t xml:space="preserve">commercial_bundle_component</w:t>
+      </w:r>
+      <w:r>
+        <w:t xml:space="preserve"> </w:t>
+      </w:r>
+      <w:r>
+        <w:t xml:space="preserve">—</w:t>
+      </w:r>
+      <w:r>
+        <w:t xml:space="preserve"> </w:t>
+      </w:r>
+      <w:r>
+        <w:rPr>
+          <w:bCs/>
+          <w:b/>
+        </w:rPr>
+        <w:t xml:space="preserve">the bundle → package link</w:t>
+      </w:r>
+      <w:r>
+        <w:t xml:space="preserve"> </w:t>
+      </w:r>
+      <w:r>
+        <w:t xml:space="preserve">(</w:t>
+      </w:r>
+      <w:r>
+        <w:rPr>
+          <w:rStyle w:val="VerbatimChar"/>
+        </w:rPr>
+        <w:t xml:space="preserve">component_role</w:t>
+      </w:r>
+      <w:r>
+        <w:t xml:space="preserve">:</w:t>
+      </w:r>
+      <w:r>
+        <w:t xml:space="preserve"> </w:t>
+      </w:r>
+      <w:r>
+        <w:rPr>
+          <w:rStyle w:val="VerbatimChar"/>
+        </w:rPr>
+        <w:t xml:space="preserve">PRIMARY|ADDON|OPTIONAL|PROMOTIONAL</w:t>
+      </w:r>
+      <w:r>
+        <w:t xml:space="preserve">)</w:t>
+      </w:r>
+    </w:p>
+    <w:p>
+      <w:pPr>
+        <w:pStyle w:val="BlockText"/>
+      </w:pPr>
+      <w:r>
+        <w:t xml:space="preserve">This is how a bundle is "made of packages" — the same pattern as</w:t>
+      </w:r>
+      <w:r>
+        <w:t xml:space="preserve"> </w:t>
+      </w:r>
+      <w:r>
+        <w:rPr>
+          <w:rStyle w:val="VerbatimChar"/>
+        </w:rPr>
+        <w:t xml:space="preserve">package</w:t>
+      </w:r>
+      <w:r>
+        <w:t xml:space="preserve"> </w:t>
+      </w:r>
+      <w:r>
+        <w:t xml:space="preserve">→</w:t>
+      </w:r>
+      <w:r>
+        <w:t xml:space="preserve"> </w:t>
+      </w:r>
+      <w:r>
+        <w:rPr>
+          <w:rStyle w:val="VerbatimChar"/>
+        </w:rPr>
+        <w:t xml:space="preserve">service</w:t>
+      </w:r>
+      <w:r>
+        <w:t xml:space="preserve"> </w:t>
+      </w:r>
+      <w:r>
+        <w:t xml:space="preserve">via</w:t>
+      </w:r>
+      <w:r>
+        <w:t xml:space="preserve"> </w:t>
+      </w:r>
+      <w:r>
+        <w:rPr>
+          <w:rStyle w:val="VerbatimChar"/>
+        </w:rPr>
+        <w:t xml:space="preserve">package_service</w:t>
+      </w:r>
+      <w:r>
+        <w:t xml:space="preserve">. The bundle header carries no</w:t>
+      </w:r>
+      <w:r>
+        <w:t xml:space="preserve"> </w:t>
+      </w:r>
+      <w:r>
+        <w:rPr>
+          <w:rStyle w:val="VerbatimChar"/>
+        </w:rPr>
+        <w:t xml:space="preserve">package_ref</w:t>
+      </w:r>
+      <w:r>
+        <w:t xml:space="preserve">; the packages are these rows.</w:t>
+      </w:r>
+    </w:p>
+    <w:p>
+      <w:pPr>
+        <w:pStyle w:val="SourceCode"/>
+      </w:pPr>
+      <w:r>
+        <w:rPr>
+          <w:rStyle w:val="FunctionTok"/>
+        </w:rPr>
+        <w:t xml:space="preserve">{</w:t>
+      </w:r>
+      <w:r>
+        <w:rPr>
+          <w:rStyle w:val="NormalTok"/>
+        </w:rPr>
+        <w:t xml:space="preserve"> </w:t>
+      </w:r>
+      <w:r>
+        <w:rPr>
+          <w:rStyle w:val="DataTypeTok"/>
+        </w:rPr>
+        <w:t xml:space="preserve">"component_id"</w:t>
+      </w:r>
+      <w:r>
+        <w:rPr>
+          <w:rStyle w:val="FunctionTok"/>
+        </w:rPr>
+        <w:t xml:space="preserve">:</w:t>
+      </w:r>
+      <w:r>
+        <w:rPr>
+          <w:rStyle w:val="StringTok"/>
+        </w:rPr>
+        <w:t xml:space="preserve">"bcomp_1"</w:t>
+      </w:r>
+      <w:r>
+        <w:rPr>
+          <w:rStyle w:val="FunctionTok"/>
+        </w:rPr>
+        <w:t xml:space="preserve">,</w:t>
+      </w:r>
+      <w:r>
+        <w:rPr>
+          <w:rStyle w:val="DataTypeTok"/>
+        </w:rPr>
+        <w:t xml:space="preserve">"bundle_id"</w:t>
+      </w:r>
+      <w:r>
+        <w:rPr>
+          <w:rStyle w:val="FunctionTok"/>
+        </w:rPr>
+        <w:t xml:space="preserve">:</w:t>
+      </w:r>
+      <w:r>
+        <w:rPr>
+          <w:rStyle w:val="StringTok"/>
+        </w:rPr>
+        <w:t xml:space="preserve">"bun_triple"</w:t>
+      </w:r>
+      <w:r>
+        <w:rPr>
+          <w:rStyle w:val="FunctionTok"/>
+        </w:rPr>
+        <w:t xml:space="preserve">,</w:t>
+      </w:r>
+      <w:r>
+        <w:rPr>
+          <w:rStyle w:val="DataTypeTok"/>
+        </w:rPr>
+        <w:t xml:space="preserve">"package_ref"</w:t>
+      </w:r>
+      <w:r>
+        <w:rPr>
+          <w:rStyle w:val="FunctionTok"/>
+        </w:rPr>
+        <w:t xml:space="preserve">:</w:t>
+      </w:r>
+      <w:r>
+        <w:rPr>
+          <w:rStyle w:val="StringTok"/>
+        </w:rPr>
+        <w:t xml:space="preserve">"pkg_triple"</w:t>
+      </w:r>
+      <w:r>
+        <w:rPr>
+          <w:rStyle w:val="FunctionTok"/>
+        </w:rPr>
+        <w:t xml:space="preserve">,</w:t>
+      </w:r>
+      <w:r>
+        <w:rPr>
+          <w:rStyle w:val="DataTypeTok"/>
+        </w:rPr>
+        <w:t xml:space="preserve">"package_version_id"</w:t>
+      </w:r>
+      <w:r>
+        <w:rPr>
+          <w:rStyle w:val="FunctionTok"/>
+        </w:rPr>
+        <w:t xml:space="preserve">:</w:t>
+      </w:r>
+      <w:r>
+        <w:rPr>
+          <w:rStyle w:val="StringTok"/>
+        </w:rPr>
+        <w:t xml:space="preserve">"pv_1"</w:t>
+      </w:r>
+      <w:r>
+        <w:rPr>
+          <w:rStyle w:val="FunctionTok"/>
+        </w:rPr>
+        <w:t xml:space="preserve">,</w:t>
+      </w:r>
+      <w:r>
+        <w:rPr>
+          <w:rStyle w:val="DataTypeTok"/>
+        </w:rPr>
+        <w:t xml:space="preserve">"component_role"</w:t>
+      </w:r>
+      <w:r>
+        <w:rPr>
+          <w:rStyle w:val="FunctionTok"/>
+        </w:rPr>
+        <w:t xml:space="preserve">:</w:t>
+      </w:r>
+      <w:r>
+        <w:rPr>
+          <w:rStyle w:val="StringTok"/>
+        </w:rPr>
+        <w:t xml:space="preserve">"PRIMARY"</w:t>
+      </w:r>
+      <w:r>
+        <w:rPr>
+          <w:rStyle w:val="FunctionTok"/>
+        </w:rPr>
+        <w:t xml:space="preserve">,</w:t>
+      </w:r>
+      <w:r>
+        <w:rPr>
+          <w:rStyle w:val="DataTypeTok"/>
+        </w:rPr>
+        <w:t xml:space="preserve">"quantity"</w:t>
+      </w:r>
+      <w:r>
+        <w:rPr>
+          <w:rStyle w:val="FunctionTok"/>
+        </w:rPr>
+        <w:t xml:space="preserve">:</w:t>
+      </w:r>
+      <w:r>
+        <w:rPr>
+          <w:rStyle w:val="DecValTok"/>
+        </w:rPr>
+        <w:t xml:space="preserve">1</w:t>
+      </w:r>
+      <w:r>
+        <w:rPr>
+          <w:rStyle w:val="FunctionTok"/>
+        </w:rPr>
+        <w:t xml:space="preserve">,</w:t>
+      </w:r>
+      <w:r>
+        <w:rPr>
+          <w:rStyle w:val="DataTypeTok"/>
+        </w:rPr>
+        <w:t xml:space="preserve">"mandatory"</w:t>
+      </w:r>
+      <w:r>
+        <w:rPr>
+          <w:rStyle w:val="FunctionTok"/>
+        </w:rPr>
+        <w:t xml:space="preserve">:</w:t>
+      </w:r>
+      <w:r>
+        <w:rPr>
+          <w:rStyle w:val="KeywordTok"/>
+        </w:rPr>
+        <w:t xml:space="preserve">true</w:t>
+      </w:r>
+      <w:r>
+        <w:rPr>
+          <w:rStyle w:val="FunctionTok"/>
+        </w:rPr>
+        <w:t xml:space="preserve">,</w:t>
+      </w:r>
+      <w:r>
+        <w:rPr>
+          <w:rStyle w:val="DataTypeTok"/>
+        </w:rPr>
+        <w:t xml:space="preserve">"display_order"</w:t>
+      </w:r>
+      <w:r>
+        <w:rPr>
+          <w:rStyle w:val="FunctionTok"/>
+        </w:rPr>
+        <w:t xml:space="preserve">:</w:t>
+      </w:r>
+      <w:r>
+        <w:rPr>
+          <w:rStyle w:val="DecValTok"/>
+        </w:rPr>
+        <w:t xml:space="preserve">0</w:t>
+      </w:r>
+      <w:r>
+        <w:rPr>
+          <w:rStyle w:val="FunctionTok"/>
+        </w:rPr>
+        <w:t xml:space="preserve">,</w:t>
+      </w:r>
+      <w:r>
+        <w:rPr>
+          <w:rStyle w:val="DataTypeTok"/>
+        </w:rPr>
+        <w:t xml:space="preserve">"metadata_json"</w:t>
+      </w:r>
+      <w:r>
+        <w:rPr>
+          <w:rStyle w:val="FunctionTok"/>
+        </w:rPr>
+        <w:t xml:space="preserve">:</w:t>
+      </w:r>
+      <w:r>
+        <w:rPr>
+          <w:rStyle w:val="KeywordTok"/>
+        </w:rPr>
+        <w:t xml:space="preserve">null</w:t>
+      </w:r>
+      <w:r>
+        <w:rPr>
+          <w:rStyle w:val="NormalTok"/>
+        </w:rPr>
+        <w:t xml:space="preserve"> </w:t>
+      </w:r>
+      <w:r>
+        <w:rPr>
+          <w:rStyle w:val="FunctionTok"/>
+        </w:rPr>
+        <w:t xml:space="preserve">}</w:t>
+      </w:r>
+      <w:r>
+        <w:br/>
+      </w:r>
+      <w:r>
+        <w:rPr>
+          <w:rStyle w:val="FunctionTok"/>
+        </w:rPr>
+        <w:t xml:space="preserve">{</w:t>
+      </w:r>
+      <w:r>
+        <w:rPr>
+          <w:rStyle w:val="NormalTok"/>
+        </w:rPr>
+        <w:t xml:space="preserve"> </w:t>
+      </w:r>
+      <w:r>
+        <w:rPr>
+          <w:rStyle w:val="DataTypeTok"/>
+        </w:rPr>
+        <w:t xml:space="preserve">"component_id"</w:t>
+      </w:r>
+      <w:r>
+        <w:rPr>
+          <w:rStyle w:val="FunctionTok"/>
+        </w:rPr>
+        <w:t xml:space="preserve">:</w:t>
+      </w:r>
+      <w:r>
+        <w:rPr>
+          <w:rStyle w:val="StringTok"/>
+        </w:rPr>
+        <w:t xml:space="preserve">"bcomp_2"</w:t>
+      </w:r>
+      <w:r>
+        <w:rPr>
+          <w:rStyle w:val="FunctionTok"/>
+        </w:rPr>
+        <w:t xml:space="preserve">,</w:t>
+      </w:r>
+      <w:r>
+        <w:rPr>
+          <w:rStyle w:val="DataTypeTok"/>
+        </w:rPr>
+        <w:t xml:space="preserve">"bundle_id"</w:t>
+      </w:r>
+      <w:r>
+        <w:rPr>
+          <w:rStyle w:val="FunctionTok"/>
+        </w:rPr>
+        <w:t xml:space="preserve">:</w:t>
+      </w:r>
+      <w:r>
+        <w:rPr>
+          <w:rStyle w:val="StringTok"/>
+        </w:rPr>
+        <w:t xml:space="preserve">"bun_triple"</w:t>
+      </w:r>
+      <w:r>
+        <w:rPr>
+          <w:rStyle w:val="FunctionTok"/>
+        </w:rPr>
+        <w:t xml:space="preserve">,</w:t>
+      </w:r>
+      <w:r>
+        <w:rPr>
+          <w:rStyle w:val="DataTypeTok"/>
+        </w:rPr>
+        <w:t xml:space="preserve">"package_ref"</w:t>
+      </w:r>
+      <w:r>
+        <w:rPr>
+          <w:rStyle w:val="FunctionTok"/>
+        </w:rPr>
+        <w:t xml:space="preserve">:</w:t>
+      </w:r>
+      <w:r>
+        <w:rPr>
+          <w:rStyle w:val="StringTok"/>
+        </w:rPr>
+        <w:t xml:space="preserve">"pkg_router_addon"</w:t>
+      </w:r>
+      <w:r>
+        <w:rPr>
+          <w:rStyle w:val="FunctionTok"/>
+        </w:rPr>
+        <w:t xml:space="preserve">,</w:t>
+      </w:r>
+      <w:r>
+        <w:rPr>
+          <w:rStyle w:val="DataTypeTok"/>
+        </w:rPr>
+        <w:t xml:space="preserve">"package_version_id"</w:t>
+      </w:r>
+      <w:r>
+        <w:rPr>
+          <w:rStyle w:val="FunctionTok"/>
+        </w:rPr>
+        <w:t xml:space="preserve">:</w:t>
+      </w:r>
+      <w:r>
+        <w:rPr>
+          <w:rStyle w:val="KeywordTok"/>
+        </w:rPr>
+        <w:t xml:space="preserve">null</w:t>
+      </w:r>
+      <w:r>
+        <w:rPr>
+          <w:rStyle w:val="FunctionTok"/>
+        </w:rPr>
+        <w:t xml:space="preserve">,</w:t>
+      </w:r>
+      <w:r>
+        <w:rPr>
+          <w:rStyle w:val="DataTypeTok"/>
+        </w:rPr>
+        <w:t xml:space="preserve">"component_role"</w:t>
+      </w:r>
+      <w:r>
+        <w:rPr>
+          <w:rStyle w:val="FunctionTok"/>
+        </w:rPr>
+        <w:t xml:space="preserve">:</w:t>
+      </w:r>
+      <w:r>
+        <w:rPr>
+          <w:rStyle w:val="StringTok"/>
+        </w:rPr>
+        <w:t xml:space="preserve">"ADDON"</w:t>
+      </w:r>
+      <w:r>
+        <w:rPr>
+          <w:rStyle w:val="FunctionTok"/>
+        </w:rPr>
+        <w:t xml:space="preserve">,</w:t>
+      </w:r>
+      <w:r>
+        <w:rPr>
+          <w:rStyle w:val="DataTypeTok"/>
+        </w:rPr>
+        <w:t xml:space="preserve">"quantity"</w:t>
+      </w:r>
+      <w:r>
+        <w:rPr>
+          <w:rStyle w:val="FunctionTok"/>
+        </w:rPr>
+        <w:t xml:space="preserve">:</w:t>
+      </w:r>
+      <w:r>
+        <w:rPr>
+          <w:rStyle w:val="DecValTok"/>
+        </w:rPr>
+        <w:t xml:space="preserve">1</w:t>
+      </w:r>
+      <w:r>
+        <w:rPr>
+          <w:rStyle w:val="FunctionTok"/>
+        </w:rPr>
+        <w:t xml:space="preserve">,</w:t>
+      </w:r>
+      <w:r>
+        <w:rPr>
+          <w:rStyle w:val="DataTypeTok"/>
+        </w:rPr>
+        <w:t xml:space="preserve">"mandatory"</w:t>
+      </w:r>
+      <w:r>
+        <w:rPr>
+          <w:rStyle w:val="FunctionTok"/>
+        </w:rPr>
+        <w:t xml:space="preserve">:</w:t>
+      </w:r>
+      <w:r>
+        <w:rPr>
+          <w:rStyle w:val="KeywordTok"/>
+        </w:rPr>
+        <w:t xml:space="preserve">false</w:t>
+      </w:r>
+      <w:r>
+        <w:rPr>
+          <w:rStyle w:val="FunctionTok"/>
+        </w:rPr>
+        <w:t xml:space="preserve">,</w:t>
+      </w:r>
+      <w:r>
+        <w:rPr>
+          <w:rStyle w:val="DataTypeTok"/>
+        </w:rPr>
+        <w:t xml:space="preserve">"display_order"</w:t>
+      </w:r>
+      <w:r>
+        <w:rPr>
+          <w:rStyle w:val="FunctionTok"/>
+        </w:rPr>
+        <w:t xml:space="preserve">:</w:t>
+      </w:r>
+      <w:r>
+        <w:rPr>
+          <w:rStyle w:val="DecValTok"/>
+        </w:rPr>
+        <w:t xml:space="preserve">1</w:t>
+      </w:r>
+      <w:r>
+        <w:rPr>
+          <w:rStyle w:val="FunctionTok"/>
+        </w:rPr>
+        <w:t xml:space="preserve">,</w:t>
+      </w:r>
+      <w:r>
+        <w:rPr>
+          <w:rStyle w:val="DataTypeTok"/>
+        </w:rPr>
+        <w:t xml:space="preserve">"metadata_json"</w:t>
+      </w:r>
+      <w:r>
+        <w:rPr>
+          <w:rStyle w:val="FunctionTok"/>
+        </w:rPr>
+        <w:t xml:space="preserve">:</w:t>
+      </w:r>
+      <w:r>
+        <w:rPr>
+          <w:rStyle w:val="KeywordTok"/>
+        </w:rPr>
+        <w:t xml:space="preserve">null</w:t>
+      </w:r>
+      <w:r>
+        <w:rPr>
+          <w:rStyle w:val="NormalTok"/>
+        </w:rPr>
+        <w:t xml:space="preserve"> </w:t>
+      </w:r>
+      <w:r>
+        <w:rPr>
+          <w:rStyle w:val="FunctionTok"/>
+        </w:rPr>
+        <w:t xml:space="preserve">}</w:t>
+      </w:r>
+      <w:r>
+        <w:br/>
+      </w:r>
+      <w:r>
+        <w:rPr>
+          <w:rStyle w:val="FunctionTok"/>
+        </w:rPr>
+        <w:t xml:space="preserve">{</w:t>
+      </w:r>
+      <w:r>
+        <w:rPr>
+          <w:rStyle w:val="NormalTok"/>
+        </w:rPr>
+        <w:t xml:space="preserve"> </w:t>
+      </w:r>
+      <w:r>
+        <w:rPr>
+          <w:rStyle w:val="DataTypeTok"/>
+        </w:rPr>
+        <w:t xml:space="preserve">"component_id"</w:t>
+      </w:r>
+      <w:r>
+        <w:rPr>
+          <w:rStyle w:val="FunctionTok"/>
+        </w:rPr>
+        <w:t xml:space="preserve">:</w:t>
+      </w:r>
+      <w:r>
+        <w:rPr>
+          <w:rStyle w:val="StringTok"/>
+        </w:rPr>
+        <w:t xml:space="preserve">"bcomp_3"</w:t>
+      </w:r>
+      <w:r>
+        <w:rPr>
+          <w:rStyle w:val="FunctionTok"/>
+        </w:rPr>
+        <w:t xml:space="preserve">,</w:t>
+      </w:r>
+      <w:r>
+        <w:rPr>
+          <w:rStyle w:val="DataTypeTok"/>
+        </w:rPr>
+        <w:t xml:space="preserve">"bundle_id"</w:t>
+      </w:r>
+      <w:r>
+        <w:rPr>
+          <w:rStyle w:val="FunctionTok"/>
+        </w:rPr>
+        <w:t xml:space="preserve">:</w:t>
+      </w:r>
+      <w:r>
+        <w:rPr>
+          <w:rStyle w:val="StringTok"/>
+        </w:rPr>
+        <w:t xml:space="preserve">"bun_staff"</w:t>
+      </w:r>
+      <w:r>
+        <w:rPr>
+          <w:rStyle w:val="FunctionTok"/>
+        </w:rPr>
+        <w:t xml:space="preserve">,</w:t>
+      </w:r>
+      <w:r>
+        <w:rPr>
+          <w:rStyle w:val="DataTypeTok"/>
+        </w:rPr>
+        <w:t xml:space="preserve">"package_ref"</w:t>
+      </w:r>
+      <w:r>
+        <w:rPr>
+          <w:rStyle w:val="FunctionTok"/>
+        </w:rPr>
+        <w:t xml:space="preserve">:</w:t>
+      </w:r>
+      <w:r>
+        <w:rPr>
+          <w:rStyle w:val="StringTok"/>
+        </w:rPr>
+        <w:t xml:space="preserve">"pkg_inet"</w:t>
+      </w:r>
+      <w:r>
+        <w:rPr>
+          <w:rStyle w:val="FunctionTok"/>
+        </w:rPr>
+        <w:t xml:space="preserve">,</w:t>
+      </w:r>
+      <w:r>
+        <w:rPr>
+          <w:rStyle w:val="DataTypeTok"/>
+        </w:rPr>
+        <w:t xml:space="preserve">"package_version_id"</w:t>
+      </w:r>
+      <w:r>
+        <w:rPr>
+          <w:rStyle w:val="FunctionTok"/>
+        </w:rPr>
+        <w:t xml:space="preserve">:</w:t>
+      </w:r>
+      <w:r>
+        <w:rPr>
+          <w:rStyle w:val="StringTok"/>
+        </w:rPr>
+        <w:t xml:space="preserve">"pv_2"</w:t>
+      </w:r>
+      <w:r>
+        <w:rPr>
+          <w:rStyle w:val="FunctionTok"/>
+        </w:rPr>
+        <w:t xml:space="preserve">,</w:t>
+      </w:r>
+      <w:r>
+        <w:rPr>
+          <w:rStyle w:val="DataTypeTok"/>
+        </w:rPr>
+        <w:t xml:space="preserve">"component_role"</w:t>
+      </w:r>
+      <w:r>
+        <w:rPr>
+          <w:rStyle w:val="FunctionTok"/>
+        </w:rPr>
+        <w:t xml:space="preserve">:</w:t>
+      </w:r>
+      <w:r>
+        <w:rPr>
+          <w:rStyle w:val="StringTok"/>
+        </w:rPr>
+        <w:t xml:space="preserve">"PRIMARY"</w:t>
+      </w:r>
+      <w:r>
+        <w:rPr>
+          <w:rStyle w:val="FunctionTok"/>
+        </w:rPr>
+        <w:t xml:space="preserve">,</w:t>
+      </w:r>
+      <w:r>
+        <w:rPr>
+          <w:rStyle w:val="DataTypeTok"/>
+        </w:rPr>
+        <w:t xml:space="preserve">"quantity"</w:t>
+      </w:r>
+      <w:r>
+        <w:rPr>
+          <w:rStyle w:val="FunctionTok"/>
+        </w:rPr>
+        <w:t xml:space="preserve">:</w:t>
+      </w:r>
+      <w:r>
+        <w:rPr>
+          <w:rStyle w:val="DecValTok"/>
+        </w:rPr>
+        <w:t xml:space="preserve">1</w:t>
+      </w:r>
+      <w:r>
+        <w:rPr>
+          <w:rStyle w:val="FunctionTok"/>
+        </w:rPr>
+        <w:t xml:space="preserve">,</w:t>
+      </w:r>
+      <w:r>
+        <w:rPr>
+          <w:rStyle w:val="DataTypeTok"/>
+        </w:rPr>
+        <w:t xml:space="preserve">"mandatory"</w:t>
+      </w:r>
+      <w:r>
+        <w:rPr>
+          <w:rStyle w:val="FunctionTok"/>
+        </w:rPr>
+        <w:t xml:space="preserve">:</w:t>
+      </w:r>
+      <w:r>
+        <w:rPr>
+          <w:rStyle w:val="KeywordTok"/>
+        </w:rPr>
+        <w:t xml:space="preserve">true</w:t>
+      </w:r>
+      <w:r>
+        <w:rPr>
+          <w:rStyle w:val="FunctionTok"/>
+        </w:rPr>
+        <w:t xml:space="preserve">,</w:t>
+      </w:r>
+      <w:r>
+        <w:rPr>
+          <w:rStyle w:val="DataTypeTok"/>
+        </w:rPr>
+        <w:t xml:space="preserve">"display_order"</w:t>
+      </w:r>
+      <w:r>
+        <w:rPr>
+          <w:rStyle w:val="FunctionTok"/>
+        </w:rPr>
+        <w:t xml:space="preserve">:</w:t>
+      </w:r>
+      <w:r>
+        <w:rPr>
+          <w:rStyle w:val="DecValTok"/>
+        </w:rPr>
+        <w:t xml:space="preserve">0</w:t>
+      </w:r>
+      <w:r>
+        <w:rPr>
+          <w:rStyle w:val="FunctionTok"/>
+        </w:rPr>
+        <w:t xml:space="preserve">,</w:t>
+      </w:r>
+      <w:r>
+        <w:rPr>
+          <w:rStyle w:val="DataTypeTok"/>
+        </w:rPr>
+        <w:t xml:space="preserve">"metadata_json"</w:t>
+      </w:r>
+      <w:r>
+        <w:rPr>
+          <w:rStyle w:val="FunctionTok"/>
+        </w:rPr>
+        <w:t xml:space="preserve">:</w:t>
+      </w:r>
+      <w:r>
+        <w:rPr>
+          <w:rStyle w:val="KeywordTok"/>
+        </w:rPr>
+        <w:t xml:space="preserve">null</w:t>
+      </w:r>
+      <w:r>
+        <w:rPr>
+          <w:rStyle w:val="NormalTok"/>
+        </w:rPr>
+        <w:t xml:space="preserve"> </w:t>
+      </w:r>
+      <w:r>
+        <w:rPr>
+          <w:rStyle w:val="FunctionTok"/>
+        </w:rPr>
+        <w:t xml:space="preserve">}</w:t>
+      </w:r>
+      <w:r>
+        <w:br/>
+      </w:r>
+      <w:r>
+        <w:rPr>
+          <w:rStyle w:val="FunctionTok"/>
+        </w:rPr>
+        <w:t xml:space="preserve">{</w:t>
+      </w:r>
+      <w:r>
+        <w:rPr>
+          <w:rStyle w:val="NormalTok"/>
+        </w:rPr>
+        <w:t xml:space="preserve"> </w:t>
+      </w:r>
+      <w:r>
+        <w:rPr>
+          <w:rStyle w:val="DataTypeTok"/>
+        </w:rPr>
+        <w:t xml:space="preserve">"component_id"</w:t>
+      </w:r>
+      <w:r>
+        <w:rPr>
+          <w:rStyle w:val="FunctionTok"/>
+        </w:rPr>
+        <w:t xml:space="preserve">:</w:t>
+      </w:r>
+      <w:r>
+        <w:rPr>
+          <w:rStyle w:val="StringTok"/>
+        </w:rPr>
+        <w:t xml:space="preserve">"bcomp_4"</w:t>
+      </w:r>
+      <w:r>
+        <w:rPr>
+          <w:rStyle w:val="FunctionTok"/>
+        </w:rPr>
+        <w:t xml:space="preserve">,</w:t>
+      </w:r>
+      <w:r>
+        <w:rPr>
+          <w:rStyle w:val="DataTypeTok"/>
+        </w:rPr>
+        <w:t xml:space="preserve">"bundle_id"</w:t>
+      </w:r>
+      <w:r>
+        <w:rPr>
+          <w:rStyle w:val="FunctionTok"/>
+        </w:rPr>
+        <w:t xml:space="preserve">:</w:t>
+      </w:r>
+      <w:r>
+        <w:rPr>
+          <w:rStyle w:val="StringTok"/>
+        </w:rPr>
+        <w:t xml:space="preserve">"bun_win"</w:t>
+      </w:r>
+      <w:r>
+        <w:rPr>
+          <w:rStyle w:val="FunctionTok"/>
+        </w:rPr>
+        <w:t xml:space="preserve">,</w:t>
+      </w:r>
+      <w:r>
+        <w:rPr>
+          <w:rStyle w:val="DataTypeTok"/>
+        </w:rPr>
+        <w:t xml:space="preserve">"package_ref"</w:t>
+      </w:r>
+      <w:r>
+        <w:rPr>
+          <w:rStyle w:val="FunctionTok"/>
+        </w:rPr>
+        <w:t xml:space="preserve">:</w:t>
+      </w:r>
+      <w:r>
+        <w:rPr>
+          <w:rStyle w:val="StringTok"/>
+        </w:rPr>
+        <w:t xml:space="preserve">"pkg_triple"</w:t>
+      </w:r>
+      <w:r>
+        <w:rPr>
+          <w:rStyle w:val="FunctionTok"/>
+        </w:rPr>
+        <w:t xml:space="preserve">,</w:t>
+      </w:r>
+      <w:r>
+        <w:rPr>
+          <w:rStyle w:val="DataTypeTok"/>
+        </w:rPr>
+        <w:t xml:space="preserve">"package_version_id"</w:t>
+      </w:r>
+      <w:r>
+        <w:rPr>
+          <w:rStyle w:val="FunctionTok"/>
+        </w:rPr>
+        <w:t xml:space="preserve">:</w:t>
+      </w:r>
+      <w:r>
+        <w:rPr>
+          <w:rStyle w:val="KeywordTok"/>
+        </w:rPr>
+        <w:t xml:space="preserve">null</w:t>
+      </w:r>
+      <w:r>
+        <w:rPr>
+          <w:rStyle w:val="FunctionTok"/>
+        </w:rPr>
+        <w:t xml:space="preserve">,</w:t>
+      </w:r>
+      <w:r>
+        <w:rPr>
+          <w:rStyle w:val="DataTypeTok"/>
+        </w:rPr>
+        <w:t xml:space="preserve">"component_role"</w:t>
+      </w:r>
+      <w:r>
+        <w:rPr>
+          <w:rStyle w:val="FunctionTok"/>
+        </w:rPr>
+        <w:t xml:space="preserve">:</w:t>
+      </w:r>
+      <w:r>
+        <w:rPr>
+          <w:rStyle w:val="StringTok"/>
+        </w:rPr>
+        <w:t xml:space="preserve">"PROMOTIONAL"</w:t>
+      </w:r>
+      <w:r>
+        <w:rPr>
+          <w:rStyle w:val="FunctionTok"/>
+        </w:rPr>
+        <w:t xml:space="preserve">,</w:t>
+      </w:r>
+      <w:r>
+        <w:rPr>
+          <w:rStyle w:val="DataTypeTok"/>
+        </w:rPr>
+        <w:t xml:space="preserve">"quantity"</w:t>
+      </w:r>
+      <w:r>
+        <w:rPr>
+          <w:rStyle w:val="FunctionTok"/>
+        </w:rPr>
+        <w:t xml:space="preserve">:</w:t>
+      </w:r>
+      <w:r>
+        <w:rPr>
+          <w:rStyle w:val="DecValTok"/>
+        </w:rPr>
+        <w:t xml:space="preserve">1</w:t>
+      </w:r>
+      <w:r>
+        <w:rPr>
+          <w:rStyle w:val="FunctionTok"/>
+        </w:rPr>
+        <w:t xml:space="preserve">,</w:t>
+      </w:r>
+      <w:r>
+        <w:rPr>
+          <w:rStyle w:val="DataTypeTok"/>
+        </w:rPr>
+        <w:t xml:space="preserve">"mandatory"</w:t>
+      </w:r>
+      <w:r>
+        <w:rPr>
+          <w:rStyle w:val="FunctionTok"/>
+        </w:rPr>
+        <w:t xml:space="preserve">:</w:t>
+      </w:r>
+      <w:r>
+        <w:rPr>
+          <w:rStyle w:val="KeywordTok"/>
+        </w:rPr>
+        <w:t xml:space="preserve">true</w:t>
+      </w:r>
+      <w:r>
+        <w:rPr>
+          <w:rStyle w:val="FunctionTok"/>
+        </w:rPr>
+        <w:t xml:space="preserve">,</w:t>
+      </w:r>
+      <w:r>
+        <w:rPr>
+          <w:rStyle w:val="DataTypeTok"/>
+        </w:rPr>
+        <w:t xml:space="preserve">"display_order"</w:t>
+      </w:r>
+      <w:r>
+        <w:rPr>
+          <w:rStyle w:val="FunctionTok"/>
+        </w:rPr>
+        <w:t xml:space="preserve">:</w:t>
+      </w:r>
+      <w:r>
+        <w:rPr>
+          <w:rStyle w:val="DecValTok"/>
+        </w:rPr>
+        <w:t xml:space="preserve">0</w:t>
+      </w:r>
+      <w:r>
+        <w:rPr>
+          <w:rStyle w:val="FunctionTok"/>
+        </w:rPr>
+        <w:t xml:space="preserve">,</w:t>
+      </w:r>
+      <w:r>
+        <w:rPr>
+          <w:rStyle w:val="DataTypeTok"/>
+        </w:rPr>
+        <w:t xml:space="preserve">"metadata_json"</w:t>
+      </w:r>
+      <w:r>
+        <w:rPr>
+          <w:rStyle w:val="FunctionTok"/>
+        </w:rPr>
+        <w:t xml:space="preserve">:{</w:t>
+      </w:r>
+      <w:r>
+        <w:rPr>
+          <w:rStyle w:val="DataTypeTok"/>
+        </w:rPr>
+        <w:t xml:space="preserve">"promoMonths"</w:t>
+      </w:r>
+      <w:r>
+        <w:rPr>
+          <w:rStyle w:val="FunctionTok"/>
+        </w:rPr>
+        <w:t xml:space="preserve">:</w:t>
+      </w:r>
+      <w:r>
+        <w:rPr>
+          <w:rStyle w:val="DecValTok"/>
+        </w:rPr>
+        <w:t xml:space="preserve">3</w:t>
+      </w:r>
+      <w:r>
+        <w:rPr>
+          <w:rStyle w:val="FunctionTok"/>
+        </w:rPr>
+        <w:t xml:space="preserve">}</w:t>
+      </w:r>
+      <w:r>
+        <w:rPr>
+          <w:rStyle w:val="NormalTok"/>
+        </w:rPr>
+        <w:t xml:space="preserve"> </w:t>
+      </w:r>
+      <w:r>
+        <w:rPr>
+          <w:rStyle w:val="FunctionTok"/>
+        </w:rPr>
+        <w:t xml:space="preserve">}</w:t>
+      </w:r>
+    </w:p>
+    <w:p>
+      <w:pPr>
+        <w:pStyle w:val="FirstParagraph"/>
+      </w:pPr>
+      <w:r>
+        <w:rPr>
+          <w:bCs/>
+          <w:b/>
+        </w:rPr>
+        <w:t xml:space="preserve">Read each row as a sentence —</w:t>
+      </w:r>
+      <w:r>
+        <w:rPr>
+          <w:bCs/>
+          <w:b/>
+        </w:rPr>
+        <w:t xml:space="preserve"> </w:t>
+      </w:r>
+      <w:r>
+        <w:rPr>
+          <w:iCs/>
+          <w:i/>
+          <w:bCs/>
+          <w:b/>
+        </w:rPr>
+        <w:t xml:space="preserve">this data means this:</w:t>
       </w:r>
     </w:p>
     <w:tbl>
@@ -28919,7 +30074,7 @@
               <w:jc w:val="left"/>
             </w:pPr>
             <w:r>
-              <w:t xml:space="preserve">Service</w:t>
+              <w:t xml:space="preserve">Row</w:t>
             </w:r>
           </w:p>
         </w:tc>
@@ -28931,7 +30086,7 @@
               <w:jc w:val="left"/>
             </w:pPr>
             <w:r>
-              <w:t xml:space="preserve">Responsibility</w:t>
+              <w:t xml:space="preserve">What it means in plain English</w:t>
             </w:r>
           </w:p>
         </w:tc>
@@ -28946,9 +30101,10 @@
             </w:pPr>
             <w:r>
               <w:rPr>
-                <w:rStyle w:val="VerbatimChar"/>
+                <w:bCs/>
+                <w:b/>
               </w:rPr>
-              <w:t xml:space="preserve">CatalogService</w:t>
+              <w:t xml:space="preserve">bcomp_1</w:t>
             </w:r>
           </w:p>
         </w:tc>
@@ -28960,7 +30116,86 @@
               <w:jc w:val="left"/>
             </w:pPr>
             <w:r>
-              <w:t xml:space="preserve">packages/services/versions CRUD + lifecycle</w:t>
+              <w:t xml:space="preserve">The "Triple Saver" bundle's</w:t>
+            </w:r>
+            <w:r>
+              <w:t xml:space="preserve"> </w:t>
+            </w:r>
+            <w:r>
+              <w:rPr>
+                <w:bCs/>
+                <w:b/>
+              </w:rPr>
+              <w:t xml:space="preserve">core package</w:t>
+            </w:r>
+            <w:r>
+              <w:t xml:space="preserve"> </w:t>
+            </w:r>
+            <w:r>
+              <w:t xml:space="preserve">=</w:t>
+            </w:r>
+            <w:r>
+              <w:t xml:space="preserve"> </w:t>
+            </w:r>
+            <w:r>
+              <w:rPr>
+                <w:rStyle w:val="VerbatimChar"/>
+              </w:rPr>
+              <w:t xml:space="preserve">pkg_triple</w:t>
+            </w:r>
+            <w:r>
+              <w:t xml:space="preserve">, pinned to version</w:t>
+            </w:r>
+            <w:r>
+              <w:t xml:space="preserve"> </w:t>
+            </w:r>
+            <w:r>
+              <w:rPr>
+                <w:rStyle w:val="VerbatimChar"/>
+              </w:rPr>
+              <w:t xml:space="preserve">pv_1</w:t>
+            </w:r>
+            <w:r>
+              <w:t xml:space="preserve"> </w:t>
+            </w:r>
+            <w:r>
+              <w:t xml:space="preserve">—</w:t>
+            </w:r>
+            <w:r>
+              <w:t xml:space="preserve"> </w:t>
+            </w:r>
+            <w:r>
+              <w:rPr>
+                <w:rStyle w:val="VerbatimChar"/>
+              </w:rPr>
+              <w:t xml:space="preserve">PRIMARY</w:t>
+            </w:r>
+            <w:r>
+              <w:t xml:space="preserve"> </w:t>
+            </w:r>
+            <w:r>
+              <w:t xml:space="preserve">and</w:t>
+            </w:r>
+            <w:r>
+              <w:t xml:space="preserve"> </w:t>
+            </w:r>
+            <w:r>
+              <w:rPr>
+                <w:rStyle w:val="VerbatimChar"/>
+              </w:rPr>
+              <w:t xml:space="preserve">mandatory</w:t>
+            </w:r>
+            <w:r>
+              <w:t xml:space="preserve">, shown first (</w:t>
+            </w:r>
+            <w:r>
+              <w:rPr>
+                <w:rStyle w:val="VerbatimChar"/>
+              </w:rPr>
+              <w:t xml:space="preserve">display_order=0</w:t>
+            </w:r>
+            <w:r>
+              <w:t xml:space="preserve">).</w:t>
             </w:r>
           </w:p>
         </w:tc>
@@ -28975,9 +30210,10 @@
             </w:pPr>
             <w:r>
               <w:rPr>
-                <w:rStyle w:val="VerbatimChar"/>
+                <w:bCs/>
+                <w:b/>
               </w:rPr>
-              <w:t xml:space="preserve">PackageLaunchService</w:t>
+              <w:t xml:space="preserve">bcomp_2</w:t>
             </w:r>
           </w:p>
         </w:tc>
@@ -28989,7 +30225,7 @@
               <w:jc w:val="left"/>
             </w:pPr>
             <w:r>
-              <w:t xml:space="preserve">SIP-02 maker-checker launch (EM-CFG-04 +</w:t>
+              <w:t xml:space="preserve">The same bundle also offers a</w:t>
             </w:r>
             <w:r>
               <w:t xml:space="preserve"> </w:t>
@@ -28998,10 +30234,38 @@
               <w:rPr>
                 <w:rStyle w:val="VerbatimChar"/>
               </w:rPr>
-              <w:t xml:space="preserve">ApplyPackageLaunchApproval</w:t>
-            </w:r>
-            <w:r>
-              <w:t xml:space="preserve">)</w:t>
+              <w:t xml:space="preserve">pkg_router_addon</w:t>
+            </w:r>
+            <w:r>
+              <w:t xml:space="preserve"> </w:t>
+            </w:r>
+            <w:r>
+              <w:t xml:space="preserve">as an</w:t>
+            </w:r>
+            <w:r>
+              <w:t xml:space="preserve"> </w:t>
+            </w:r>
+            <w:r>
+              <w:rPr>
+                <w:bCs/>
+                <w:b/>
+              </w:rPr>
+              <w:t xml:space="preserve">optional ADD-ON</w:t>
+            </w:r>
+            <w:r>
+              <w:t xml:space="preserve"> </w:t>
+            </w:r>
+            <w:r>
+              <w:t xml:space="preserve">(</w:t>
+            </w:r>
+            <w:r>
+              <w:rPr>
+                <w:rStyle w:val="VerbatimChar"/>
+              </w:rPr>
+              <w:t xml:space="preserve">mandatory=false</w:t>
+            </w:r>
+            <w:r>
+              <w:t xml:space="preserve">); no pinned version, so it takes the package's current one.</w:t>
             </w:r>
           </w:p>
         </w:tc>
@@ -29016,24 +30280,10 @@
             </w:pPr>
             <w:r>
               <w:rPr>
-                <w:rStyle w:val="VerbatimChar"/>
+                <w:bCs/>
+                <w:b/>
               </w:rPr>
-              <w:t xml:space="preserve">BundleService</w:t>
-            </w:r>
-            <w:r>
-              <w:t xml:space="preserve"> </w:t>
-            </w:r>
-            <w:r>
-              <w:t xml:space="preserve">/</w:t>
-            </w:r>
-            <w:r>
-              <w:t xml:space="preserve"> </w:t>
-            </w:r>
-            <w:r>
-              <w:rPr>
-                <w:rStyle w:val="VerbatimChar"/>
-              </w:rPr>
-              <w:t xml:space="preserve">CampaignService</w:t>
+              <w:t xml:space="preserve">bcomp_3</w:t>
             </w:r>
           </w:p>
         </w:tc>
@@ -29045,7 +30295,37 @@
               <w:jc w:val="left"/>
             </w:pPr>
             <w:r>
-              <w:t xml:space="preserve">bundles + promotions</w:t>
+              <w:t xml:space="preserve">The Staff bundle is just one package (</w:t>
+            </w:r>
+            <w:r>
+              <w:rPr>
+                <w:rStyle w:val="VerbatimChar"/>
+              </w:rPr>
+              <w:t xml:space="preserve">pkg_inet</w:t>
+            </w:r>
+            <w:r>
+              <w:t xml:space="preserve">@</w:t>
+            </w:r>
+            <w:r>
+              <w:rPr>
+                <w:rStyle w:val="VerbatimChar"/>
+              </w:rPr>
+              <w:t xml:space="preserve">pv_2</w:t>
+            </w:r>
+            <w:r>
+              <w:t xml:space="preserve">),</w:t>
+            </w:r>
+            <w:r>
+              <w:t xml:space="preserve"> </w:t>
+            </w:r>
+            <w:r>
+              <w:rPr>
+                <w:rStyle w:val="VerbatimChar"/>
+              </w:rPr>
+              <w:t xml:space="preserve">PRIMARY</w:t>
+            </w:r>
+            <w:r>
+              <w:t xml:space="preserve">/mandatory.</w:t>
             </w:r>
           </w:p>
         </w:tc>
@@ -29060,24 +30340,10 @@
             </w:pPr>
             <w:r>
               <w:rPr>
-                <w:rStyle w:val="VerbatimChar"/>
+                <w:bCs/>
+                <w:b/>
               </w:rPr>
-              <w:t xml:space="preserve">DiscountAssignmentService</w:t>
-            </w:r>
-            <w:r>
-              <w:t xml:space="preserve"> </w:t>
-            </w:r>
-            <w:r>
-              <w:t xml:space="preserve">/</w:t>
-            </w:r>
-            <w:r>
-              <w:t xml:space="preserve"> </w:t>
-            </w:r>
-            <w:r>
-              <w:rPr>
-                <w:rStyle w:val="VerbatimChar"/>
-              </w:rPr>
-              <w:t xml:space="preserve">DiscountComputeService</w:t>
+              <w:t xml:space="preserve">bcomp_4</w:t>
             </w:r>
           </w:p>
         </w:tc>
@@ -29089,7 +30355,7 @@
               <w:jc w:val="left"/>
             </w:pPr>
             <w:r>
-              <w:t xml:space="preserve">grant</w:t>
+              <w:t xml:space="preserve">The Winback bundle bundles</w:t>
             </w:r>
             <w:r>
               <w:t xml:space="preserve"> </w:t>
@@ -29098,13 +30364,13 @@
               <w:rPr>
                 <w:rStyle w:val="VerbatimChar"/>
               </w:rPr>
-              <w:t xml:space="preserve">create()</w:t>
+              <w:t xml:space="preserve">pkg_triple</w:t>
             </w:r>
             <w:r>
               <w:t xml:space="preserve"> </w:t>
             </w:r>
             <w:r>
-              <w:t xml:space="preserve">(dup-block + EM-CFG-04) /</w:t>
+              <w:t xml:space="preserve">as a</w:t>
             </w:r>
             <w:r>
               <w:t xml:space="preserve"> </w:t>
@@ -29113,13 +30379,200 @@
               <w:rPr>
                 <w:rStyle w:val="VerbatimChar"/>
               </w:rPr>
-              <w:t xml:space="preserve">compute()</w:t>
+              <w:t xml:space="preserve">PROMOTIONAL</w:t>
             </w:r>
             <w:r>
               <w:t xml:space="preserve"> </w:t>
             </w:r>
             <w:r>
-              <w:t xml:space="preserve">effective discount (stacking)</w:t>
+              <w:t xml:space="preserve">component, with a 3-month promo flag in</w:t>
+            </w:r>
+            <w:r>
+              <w:t xml:space="preserve"> </w:t>
+            </w:r>
+            <w:r>
+              <w:rPr>
+                <w:rStyle w:val="VerbatimChar"/>
+              </w:rPr>
+              <w:t xml:space="preserve">metadata_json</w:t>
+            </w:r>
+            <w:r>
+              <w:t xml:space="preserve">.</w:t>
+            </w:r>
+          </w:p>
+        </w:tc>
+      </w:tr>
+    </w:tbl>
+    <w:p>
+      <w:pPr>
+        <w:pStyle w:val="BodyText"/>
+      </w:pPr>
+      <w:r>
+        <w:rPr>
+          <w:bCs/>
+          <w:b/>
+        </w:rPr>
+        <w:t xml:space="preserve">The columns that did the work:</w:t>
+      </w:r>
+      <w:r>
+        <w:t xml:space="preserve"> </w:t>
+      </w:r>
+      <w:r>
+        <w:rPr>
+          <w:rStyle w:val="VerbatimChar"/>
+        </w:rPr>
+        <w:t xml:space="preserve">bundle_id</w:t>
+      </w:r>
+      <w:r>
+        <w:t xml:space="preserve"> </w:t>
+      </w:r>
+      <w:r>
+        <w:t xml:space="preserve">+</w:t>
+      </w:r>
+      <w:r>
+        <w:t xml:space="preserve"> </w:t>
+      </w:r>
+      <w:r>
+        <w:rPr>
+          <w:rStyle w:val="VerbatimChar"/>
+        </w:rPr>
+        <w:t xml:space="preserve">package_ref</w:t>
+      </w:r>
+      <w:r>
+        <w:t xml:space="preserve"> </w:t>
+      </w:r>
+      <w:r>
+        <w:t xml:space="preserve">are the link;</w:t>
+      </w:r>
+      <w:r>
+        <w:t xml:space="preserve"> </w:t>
+      </w:r>
+      <w:r>
+        <w:rPr>
+          <w:rStyle w:val="VerbatimChar"/>
+        </w:rPr>
+        <w:t xml:space="preserve">package_version_id</w:t>
+      </w:r>
+      <w:r>
+        <w:t xml:space="preserve"> </w:t>
+      </w:r>
+      <w:r>
+        <w:t xml:space="preserve">pins a</w:t>
+      </w:r>
+      <w:r>
+        <w:t xml:space="preserve"> </w:t>
+      </w:r>
+      <w:r>
+        <w:t xml:space="preserve">version (null = the package's current one);</w:t>
+      </w:r>
+      <w:r>
+        <w:t xml:space="preserve"> </w:t>
+      </w:r>
+      <w:r>
+        <w:rPr>
+          <w:rStyle w:val="VerbatimChar"/>
+        </w:rPr>
+        <w:t xml:space="preserve">component_role</w:t>
+      </w:r>
+      <w:r>
+        <w:t xml:space="preserve">/</w:t>
+      </w:r>
+      <w:r>
+        <w:rPr>
+          <w:rStyle w:val="VerbatimChar"/>
+        </w:rPr>
+        <w:t xml:space="preserve">mandatory</w:t>
+      </w:r>
+      <w:r>
+        <w:t xml:space="preserve"> </w:t>
+      </w:r>
+      <w:r>
+        <w:t xml:space="preserve">say whether it's the core offer</w:t>
+      </w:r>
+      <w:r>
+        <w:t xml:space="preserve"> </w:t>
+      </w:r>
+      <w:r>
+        <w:t xml:space="preserve">or an optional add-on;</w:t>
+      </w:r>
+      <w:r>
+        <w:t xml:space="preserve"> </w:t>
+      </w:r>
+      <w:r>
+        <w:rPr>
+          <w:rStyle w:val="VerbatimChar"/>
+        </w:rPr>
+        <w:t xml:space="preserve">display_order</w:t>
+      </w:r>
+      <w:r>
+        <w:t xml:space="preserve"> </w:t>
+      </w:r>
+      <w:r>
+        <w:t xml:space="preserve">is the sell order;</w:t>
+      </w:r>
+      <w:r>
+        <w:t xml:space="preserve"> </w:t>
+      </w:r>
+      <w:r>
+        <w:rPr>
+          <w:rStyle w:val="VerbatimChar"/>
+        </w:rPr>
+        <w:t xml:space="preserve">quantity</w:t>
+      </w:r>
+      <w:r>
+        <w:t xml:space="preserve"> </w:t>
+      </w:r>
+      <w:r>
+        <w:t xml:space="preserve">how many.</w:t>
+      </w:r>
+    </w:p>
+    <w:bookmarkEnd w:id="66"/>
+    <w:bookmarkEnd w:id="67"/>
+    <w:bookmarkStart w:id="68" w:name="Xfb5d98d392a65f9c5ec838f4edf46bff01392c1"/>
+    <w:p>
+      <w:pPr>
+        <w:pStyle w:val="Heading2"/>
+      </w:pPr>
+      <w:r>
+        <w:t xml:space="preserve">3. Services</w:t>
+      </w:r>
+    </w:p>
+    <w:tbl>
+      <w:tblPr>
+        <w:tblStyle w:val="Table"/>
+        <w:tblW w:type="auto" w:w="0"/>
+        <w:tblLook w:firstRow="1" w:lastRow="0" w:firstColumn="0" w:lastColumn="0" w:noHBand="0" w:noVBand="0" w:val="0020"/>
+        <w:jc w:val="start"/>
+      </w:tblPr>
+      <w:tblGrid>
+        <w:gridCol w:w="3960"/>
+        <w:gridCol w:w="3960"/>
+      </w:tblGrid>
+      <w:tr>
+        <w:trPr>
+          <w:tblHeader w:val="true"/>
+        </w:trPr>
+        <w:tc>
+          <w:tcPr/>
+          <w:p>
+            <w:pPr>
+              <w:pStyle w:val="Compact"/>
+              <w:jc w:val="left"/>
+            </w:pPr>
+            <w:r>
+              <w:t xml:space="preserve">Service</w:t>
+            </w:r>
+          </w:p>
+        </w:tc>
+        <w:tc>
+          <w:tcPr/>
+          <w:p>
+            <w:pPr>
+              <w:pStyle w:val="Compact"/>
+              <w:jc w:val="left"/>
+            </w:pPr>
+            <w:r>
+              <w:t xml:space="preserve">Responsibility</w:t>
             </w:r>
           </w:p>
         </w:tc>
@@ -29136,22 +30589,7 @@
               <w:rPr>
                 <w:rStyle w:val="VerbatimChar"/>
               </w:rPr>
-              <w:t xml:space="preserve">TaxComputeService</w:t>
-            </w:r>
-            <w:r>
-              <w:t xml:space="preserve"> </w:t>
-            </w:r>
-            <w:r>
-              <w:t xml:space="preserve">/</w:t>
-            </w:r>
-            <w:r>
-              <w:t xml:space="preserve"> </w:t>
-            </w:r>
-            <w:r>
-              <w:rPr>
-                <w:rStyle w:val="VerbatimChar"/>
-              </w:rPr>
-              <w:t xml:space="preserve">TaxConfigService</w:t>
+              <w:t xml:space="preserve">CatalogService</w:t>
             </w:r>
           </w:p>
         </w:tc>
@@ -29163,31 +30601,7 @@
               <w:jc w:val="left"/>
             </w:pPr>
             <w:r>
-              <w:rPr>
-                <w:rStyle w:val="VerbatimChar"/>
-              </w:rPr>
-              <w:t xml:space="preserve">compute()</w:t>
-            </w:r>
-            <w:r>
-              <w:t xml:space="preserve"> </w:t>
-            </w:r>
-            <w:r>
-              <w:t xml:space="preserve">via</w:t>
-            </w:r>
-            <w:r>
-              <w:t xml:space="preserve"> </w:t>
-            </w:r>
-            <w:r>
-              <w:rPr>
-                <w:rStyle w:val="VerbatimChar"/>
-              </w:rPr>
-              <w:t xml:space="preserve">rules.tax-applicability</w:t>
-            </w:r>
-            <w:r>
-              <w:t xml:space="preserve"> </w:t>
-            </w:r>
-            <w:r>
-              <w:t xml:space="preserve">cascade / tax config</w:t>
+              <w:t xml:space="preserve">packages/services/versions CRUD + lifecycle</w:t>
             </w:r>
           </w:p>
         </w:tc>
@@ -29204,22 +30618,7 @@
               <w:rPr>
                 <w:rStyle w:val="VerbatimChar"/>
               </w:rPr>
-              <w:t xml:space="preserve">VoiceTariffService</w:t>
-            </w:r>
-            <w:r>
-              <w:t xml:space="preserve"> </w:t>
-            </w:r>
-            <w:r>
-              <w:t xml:space="preserve">/</w:t>
-            </w:r>
-            <w:r>
-              <w:t xml:space="preserve"> </w:t>
-            </w:r>
-            <w:r>
-              <w:rPr>
-                <w:rStyle w:val="VerbatimChar"/>
-              </w:rPr>
-              <w:t xml:space="preserve">UsageRatingService</w:t>
+              <w:t xml:space="preserve">PackageLaunchService</w:t>
             </w:r>
           </w:p>
         </w:tc>
@@ -29231,7 +30630,19 @@
               <w:jc w:val="left"/>
             </w:pPr>
             <w:r>
-              <w:t xml:space="preserve">rate metered events (longest-prefix)</w:t>
+              <w:t xml:space="preserve">SIP-02 maker-checker launch (EM-CFG-04 +</w:t>
+            </w:r>
+            <w:r>
+              <w:t xml:space="preserve"> </w:t>
+            </w:r>
+            <w:r>
+              <w:rPr>
+                <w:rStyle w:val="VerbatimChar"/>
+              </w:rPr>
+              <w:t xml:space="preserve">ApplyPackageLaunchApproval</w:t>
+            </w:r>
+            <w:r>
+              <w:t xml:space="preserve">)</w:t>
             </w:r>
           </w:p>
         </w:tc>
@@ -29248,7 +30659,22 @@
               <w:rPr>
                 <w:rStyle w:val="VerbatimChar"/>
               </w:rPr>
-              <w:t xml:space="preserve">WalletCatalogService</w:t>
+              <w:t xml:space="preserve">BundleService</w:t>
+            </w:r>
+            <w:r>
+              <w:t xml:space="preserve"> </w:t>
+            </w:r>
+            <w:r>
+              <w:t xml:space="preserve">/</w:t>
+            </w:r>
+            <w:r>
+              <w:t xml:space="preserve"> </w:t>
+            </w:r>
+            <w:r>
+              <w:rPr>
+                <w:rStyle w:val="VerbatimChar"/>
+              </w:rPr>
+              <w:t xml:space="preserve">CampaignService</w:t>
             </w:r>
           </w:p>
         </w:tc>
@@ -29260,7 +30686,7 @@
               <w:jc w:val="left"/>
             </w:pPr>
             <w:r>
-              <w:t xml:space="preserve">wallet-type catalog (PLM-CFG-03)</w:t>
+              <w:t xml:space="preserve">bundles + promotions</w:t>
             </w:r>
           </w:p>
         </w:tc>
@@ -29277,7 +30703,7 @@
               <w:rPr>
                 <w:rStyle w:val="VerbatimChar"/>
               </w:rPr>
-              <w:t xml:space="preserve">HomePassTopologyService</w:t>
+              <w:t xml:space="preserve">DiscountAssignmentService</w:t>
             </w:r>
             <w:r>
               <w:t xml:space="preserve"> </w:t>
@@ -29292,22 +30718,7 @@
               <w:rPr>
                 <w:rStyle w:val="VerbatimChar"/>
               </w:rPr>
-              <w:t xml:space="preserve">NetworkCatalogService</w:t>
-            </w:r>
-            <w:r>
-              <w:t xml:space="preserve"> </w:t>
-            </w:r>
-            <w:r>
-              <w:t xml:space="preserve">/</w:t>
-            </w:r>
-            <w:r>
-              <w:t xml:space="preserve"> </w:t>
-            </w:r>
-            <w:r>
-              <w:rPr>
-                <w:rStyle w:val="VerbatimChar"/>
-              </w:rPr>
-              <w:t xml:space="preserve">TechCoverageService</w:t>
+              <w:t xml:space="preserve">DiscountComputeService</w:t>
             </w:r>
           </w:p>
         </w:tc>
@@ -29319,14 +30730,244 @@
               <w:jc w:val="left"/>
             </w:pPr>
             <w:r>
+              <w:t xml:space="preserve">grant</w:t>
+            </w:r>
+            <w:r>
+              <w:t xml:space="preserve"> </w:t>
+            </w:r>
+            <w:r>
+              <w:rPr>
+                <w:rStyle w:val="VerbatimChar"/>
+              </w:rPr>
+              <w:t xml:space="preserve">create()</w:t>
+            </w:r>
+            <w:r>
+              <w:t xml:space="preserve"> </w:t>
+            </w:r>
+            <w:r>
+              <w:t xml:space="preserve">(dup-block + EM-CFG-04) /</w:t>
+            </w:r>
+            <w:r>
+              <w:t xml:space="preserve"> </w:t>
+            </w:r>
+            <w:r>
+              <w:rPr>
+                <w:rStyle w:val="VerbatimChar"/>
+              </w:rPr>
+              <w:t xml:space="preserve">compute()</w:t>
+            </w:r>
+            <w:r>
+              <w:t xml:space="preserve"> </w:t>
+            </w:r>
+            <w:r>
+              <w:t xml:space="preserve">effective discount (stacking)</w:t>
+            </w:r>
+          </w:p>
+        </w:tc>
+      </w:tr>
+      <w:tr>
+        <w:tc>
+          <w:tcPr/>
+          <w:p>
+            <w:pPr>
+              <w:pStyle w:val="Compact"/>
+              <w:jc w:val="left"/>
+            </w:pPr>
+            <w:r>
+              <w:rPr>
+                <w:rStyle w:val="VerbatimChar"/>
+              </w:rPr>
+              <w:t xml:space="preserve">TaxComputeService</w:t>
+            </w:r>
+            <w:r>
+              <w:t xml:space="preserve"> </w:t>
+            </w:r>
+            <w:r>
+              <w:t xml:space="preserve">/</w:t>
+            </w:r>
+            <w:r>
+              <w:t xml:space="preserve"> </w:t>
+            </w:r>
+            <w:r>
+              <w:rPr>
+                <w:rStyle w:val="VerbatimChar"/>
+              </w:rPr>
+              <w:t xml:space="preserve">TaxConfigService</w:t>
+            </w:r>
+          </w:p>
+        </w:tc>
+        <w:tc>
+          <w:tcPr/>
+          <w:p>
+            <w:pPr>
+              <w:pStyle w:val="Compact"/>
+              <w:jc w:val="left"/>
+            </w:pPr>
+            <w:r>
+              <w:rPr>
+                <w:rStyle w:val="VerbatimChar"/>
+              </w:rPr>
+              <w:t xml:space="preserve">compute()</w:t>
+            </w:r>
+            <w:r>
+              <w:t xml:space="preserve"> </w:t>
+            </w:r>
+            <w:r>
+              <w:t xml:space="preserve">via</w:t>
+            </w:r>
+            <w:r>
+              <w:t xml:space="preserve"> </w:t>
+            </w:r>
+            <w:r>
+              <w:rPr>
+                <w:rStyle w:val="VerbatimChar"/>
+              </w:rPr>
+              <w:t xml:space="preserve">rules.tax-applicability</w:t>
+            </w:r>
+            <w:r>
+              <w:t xml:space="preserve"> </w:t>
+            </w:r>
+            <w:r>
+              <w:t xml:space="preserve">cascade / tax config</w:t>
+            </w:r>
+          </w:p>
+        </w:tc>
+      </w:tr>
+      <w:tr>
+        <w:tc>
+          <w:tcPr/>
+          <w:p>
+            <w:pPr>
+              <w:pStyle w:val="Compact"/>
+              <w:jc w:val="left"/>
+            </w:pPr>
+            <w:r>
+              <w:rPr>
+                <w:rStyle w:val="VerbatimChar"/>
+              </w:rPr>
+              <w:t xml:space="preserve">VoiceTariffService</w:t>
+            </w:r>
+            <w:r>
+              <w:t xml:space="preserve"> </w:t>
+            </w:r>
+            <w:r>
+              <w:t xml:space="preserve">/</w:t>
+            </w:r>
+            <w:r>
+              <w:t xml:space="preserve"> </w:t>
+            </w:r>
+            <w:r>
+              <w:rPr>
+                <w:rStyle w:val="VerbatimChar"/>
+              </w:rPr>
+              <w:t xml:space="preserve">UsageRatingService</w:t>
+            </w:r>
+          </w:p>
+        </w:tc>
+        <w:tc>
+          <w:tcPr/>
+          <w:p>
+            <w:pPr>
+              <w:pStyle w:val="Compact"/>
+              <w:jc w:val="left"/>
+            </w:pPr>
+            <w:r>
+              <w:t xml:space="preserve">rate metered events (longest-prefix)</w:t>
+            </w:r>
+          </w:p>
+        </w:tc>
+      </w:tr>
+      <w:tr>
+        <w:tc>
+          <w:tcPr/>
+          <w:p>
+            <w:pPr>
+              <w:pStyle w:val="Compact"/>
+              <w:jc w:val="left"/>
+            </w:pPr>
+            <w:r>
+              <w:rPr>
+                <w:rStyle w:val="VerbatimChar"/>
+              </w:rPr>
+              <w:t xml:space="preserve">WalletCatalogService</w:t>
+            </w:r>
+          </w:p>
+        </w:tc>
+        <w:tc>
+          <w:tcPr/>
+          <w:p>
+            <w:pPr>
+              <w:pStyle w:val="Compact"/>
+              <w:jc w:val="left"/>
+            </w:pPr>
+            <w:r>
+              <w:t xml:space="preserve">wallet-type catalog (PLM-CFG-03)</w:t>
+            </w:r>
+          </w:p>
+        </w:tc>
+      </w:tr>
+      <w:tr>
+        <w:tc>
+          <w:tcPr/>
+          <w:p>
+            <w:pPr>
+              <w:pStyle w:val="Compact"/>
+              <w:jc w:val="left"/>
+            </w:pPr>
+            <w:r>
+              <w:rPr>
+                <w:rStyle w:val="VerbatimChar"/>
+              </w:rPr>
+              <w:t xml:space="preserve">HomePassTopologyService</w:t>
+            </w:r>
+            <w:r>
+              <w:t xml:space="preserve"> </w:t>
+            </w:r>
+            <w:r>
+              <w:t xml:space="preserve">/</w:t>
+            </w:r>
+            <w:r>
+              <w:t xml:space="preserve"> </w:t>
+            </w:r>
+            <w:r>
+              <w:rPr>
+                <w:rStyle w:val="VerbatimChar"/>
+              </w:rPr>
+              <w:t xml:space="preserve">NetworkCatalogService</w:t>
+            </w:r>
+            <w:r>
+              <w:t xml:space="preserve"> </w:t>
+            </w:r>
+            <w:r>
+              <w:t xml:space="preserve">/</w:t>
+            </w:r>
+            <w:r>
+              <w:t xml:space="preserve"> </w:t>
+            </w:r>
+            <w:r>
+              <w:rPr>
+                <w:rStyle w:val="VerbatimChar"/>
+              </w:rPr>
+              <w:t xml:space="preserve">TechCoverageService</w:t>
+            </w:r>
+          </w:p>
+        </w:tc>
+        <w:tc>
+          <w:tcPr/>
+          <w:p>
+            <w:pPr>
+              <w:pStyle w:val="Compact"/>
+              <w:jc w:val="left"/>
+            </w:pPr>
+            <w:r>
               <w:t xml:space="preserve">premises, plant, coverage</w:t>
             </w:r>
           </w:p>
         </w:tc>
       </w:tr>
     </w:tbl>
-    <w:bookmarkEnd w:id="67"/>
-    <w:bookmarkStart w:id="68" w:name="X3fad86b3f9f01f0516f0b94f23ef916d90447be"/>
+    <w:bookmarkEnd w:id="68"/>
+    <w:bookmarkStart w:id="69" w:name="X3fad86b3f9f01f0516f0b94f23ef916d90447be"/>
     <w:p>
       <w:pPr>
         <w:pStyle w:val="Heading2"/>
@@ -29397,8 +31038,8 @@
         <w:t xml:space="preserve">package/bundle launch via an approve/decide pair.</w:t>
       </w:r>
     </w:p>
-    <w:bookmarkEnd w:id="68"/>
-    <w:bookmarkStart w:id="69" w:name="Xcf803c44c18cbcda4fb17d128118807f77d7520"/>
+    <w:bookmarkEnd w:id="69"/>
+    <w:bookmarkStart w:id="70" w:name="Xcf803c44c18cbcda4fb17d128118807f77d7520"/>
     <w:p>
       <w:pPr>
         <w:pStyle w:val="Heading2"/>
@@ -29587,8 +31228,8 @@
         <w:t xml:space="preserve">).</w:t>
       </w:r>
     </w:p>
-    <w:bookmarkEnd w:id="69"/>
-    <w:bookmarkStart w:id="70" w:name="X89de12bcbda887c6ec5ea5eed2f747bbdb3a288"/>
+    <w:bookmarkEnd w:id="70"/>
+    <w:bookmarkStart w:id="71" w:name="X89de12bcbda887c6ec5ea5eed2f747bbdb3a288"/>
     <w:p>
       <w:pPr>
         <w:pStyle w:val="Heading2"/>
@@ -29605,8 +31246,8 @@
         <w:t xml:space="preserve">Service-level governance (approval-gated launches + HomePass transitions); no BPMN.</w:t>
       </w:r>
     </w:p>
-    <w:bookmarkEnd w:id="70"/>
-    <w:bookmarkStart w:id="71" w:name="X1bf2a627be6ee103cb059e15364eccb4d059631"/>
+    <w:bookmarkEnd w:id="71"/>
+    <w:bookmarkStart w:id="72" w:name="X1bf2a627be6ee103cb059e15364eccb4d059631"/>
     <w:p>
       <w:pPr>
         <w:pStyle w:val="Heading2"/>
@@ -29651,8 +31292,8 @@
         <w:t xml:space="preserve">tariffs, tax groups/rules, wallet types, HomePass status model, tech regions). Wananchi = re-seed.</w:t>
       </w:r>
     </w:p>
-    <w:bookmarkEnd w:id="71"/>
-    <w:bookmarkStart w:id="72" w:name="X63a8d27571a07c76bbbdc15cf677d35be107ee2"/>
+    <w:bookmarkEnd w:id="72"/>
+    <w:bookmarkStart w:id="73" w:name="X63a8d27571a07c76bbbdc15cf677d35be107ee2"/>
     <w:p>
       <w:pPr>
         <w:pStyle w:val="Heading2"/>
@@ -29711,8 +31352,8 @@
         <w:t xml:space="preserve">Foundation Approvals (launch/discount/HomePass), Rules, Cache.</w:t>
       </w:r>
     </w:p>
-    <w:bookmarkEnd w:id="72"/>
-    <w:bookmarkStart w:id="73" w:name="Xcb40a318d67ac43889cfb87b8882350a4df3626"/>
+    <w:bookmarkEnd w:id="73"/>
+    <w:bookmarkStart w:id="74" w:name="Xcb40a318d67ac43889cfb87b8882350a4df3626"/>
     <w:p>
       <w:pPr>
         <w:pStyle w:val="Heading2"/>
@@ -29960,8 +31601,8 @@
         </w:tc>
       </w:tr>
     </w:tbl>
-    <w:bookmarkEnd w:id="73"/>
-    <w:bookmarkStart w:id="74" w:name="X1a2c77c63e8658ad1f03ac43a2a805296ed69e9"/>
+    <w:bookmarkEnd w:id="74"/>
+    <w:bookmarkStart w:id="75" w:name="X1a2c77c63e8658ad1f03ac43a2a805296ed69e9"/>
     <w:p>
       <w:pPr>
         <w:pStyle w:val="Heading2"/>
@@ -30070,8 +31711,8 @@
         <w:t xml:space="preserve">distinct (contractor config vs EM-02 capacity), not duplication.</w:t>
       </w:r>
     </w:p>
-    <w:bookmarkEnd w:id="74"/>
     <w:bookmarkEnd w:id="75"/>
+    <w:bookmarkEnd w:id="76"/>
     <w:sectPr/>
   </w:body>
 </w:document>

</xml_diff>

<commit_message>
docs(catalog): regenerate rendered + docx after bundle-component correction
Co-Authored-By: Claude Opus 4.8 <noreply@anthropic.com>
Claude-Session: https://claude.ai/code/session_01RwtMRFwzHC7G5CTnGLhgKu
</commit_message>
<xml_diff>
--- a/docs/as-built/docx/catalog.docx
+++ b/docs/as-built/docx/catalog.docx
@@ -1011,7 +1011,7 @@
               <a:graphicData uri="http://schemas.openxmlformats.org/drawingml/2006/picture">
                 <pic:pic>
                   <pic:nvPicPr>
-                    <pic:cNvPr descr="/tmp/docximg-WFrKis/catalog_md_1.png" id="23" name="Picture"/>
+                    <pic:cNvPr descr="/tmp/docximg-ETXryJ/catalog_md_1.png" id="23" name="Picture"/>
                     <pic:cNvPicPr>
                       <a:picLocks noChangeArrowheads="1" noChangeAspect="1"/>
                     </pic:cNvPicPr>
@@ -1066,7 +1066,7 @@
               <a:graphicData uri="http://schemas.openxmlformats.org/drawingml/2006/picture">
                 <pic:pic>
                   <pic:nvPicPr>
-                    <pic:cNvPr descr="/tmp/docximg-WFrKis/catalog_md_2.png" id="26" name="Picture"/>
+                    <pic:cNvPr descr="/tmp/docximg-ETXryJ/catalog_md_2.png" id="26" name="Picture"/>
                     <pic:cNvPicPr>
                       <a:picLocks noChangeArrowheads="1" noChangeAspect="1"/>
                     </pic:cNvPicPr>
@@ -1750,7 +1750,7 @@
               <a:graphicData uri="http://schemas.openxmlformats.org/drawingml/2006/picture">
                 <pic:pic>
                   <pic:nvPicPr>
-                    <pic:cNvPr descr="/tmp/docximg-WFrKis/catalog_md_3.png" id="31" name="Picture"/>
+                    <pic:cNvPr descr="/tmp/docximg-ETXryJ/catalog_md_3.png" id="31" name="Picture"/>
                     <pic:cNvPicPr>
                       <a:picLocks noChangeArrowheads="1" noChangeAspect="1"/>
                     </pic:cNvPicPr>
@@ -2381,7 +2381,7 @@
               <a:graphicData uri="http://schemas.openxmlformats.org/drawingml/2006/picture">
                 <pic:pic>
                   <pic:nvPicPr>
-                    <pic:cNvPr descr="/tmp/docximg-WFrKis/catalog_md_4.png" id="36" name="Picture"/>
+                    <pic:cNvPr descr="/tmp/docximg-ETXryJ/catalog_md_4.png" id="36" name="Picture"/>
                     <pic:cNvPicPr>
                       <a:picLocks noChangeArrowheads="1" noChangeAspect="1"/>
                     </pic:cNvPicPr>
@@ -2870,7 +2870,7 @@
               <a:graphicData uri="http://schemas.openxmlformats.org/drawingml/2006/picture">
                 <pic:pic>
                   <pic:nvPicPr>
-                    <pic:cNvPr descr="/tmp/docximg-WFrKis/catalog_md_5.png" id="40" name="Picture"/>
+                    <pic:cNvPr descr="/tmp/docximg-ETXryJ/catalog_md_5.png" id="40" name="Picture"/>
                     <pic:cNvPicPr>
                       <a:picLocks noChangeArrowheads="1" noChangeAspect="1"/>
                     </pic:cNvPicPr>
@@ -3073,7 +3073,7 @@
               <a:graphicData uri="http://schemas.openxmlformats.org/drawingml/2006/picture">
                 <pic:pic>
                   <pic:nvPicPr>
-                    <pic:cNvPr descr="/tmp/docximg-WFrKis/catalog_md_6.png" id="44" name="Picture"/>
+                    <pic:cNvPr descr="/tmp/docximg-ETXryJ/catalog_md_6.png" id="44" name="Picture"/>
                     <pic:cNvPicPr>
                       <a:picLocks noChangeArrowheads="1" noChangeAspect="1"/>
                     </pic:cNvPicPr>
@@ -3650,7 +3650,7 @@
               <a:graphicData uri="http://schemas.openxmlformats.org/drawingml/2006/picture">
                 <pic:pic>
                   <pic:nvPicPr>
-                    <pic:cNvPr descr="/tmp/docximg-WFrKis/catalog_md_7.png" id="49" name="Picture"/>
+                    <pic:cNvPr descr="/tmp/docximg-ETXryJ/catalog_md_7.png" id="49" name="Picture"/>
                     <pic:cNvPicPr>
                       <a:picLocks noChangeArrowheads="1" noChangeAspect="1"/>
                     </pic:cNvPicPr>
@@ -6864,7 +6864,7 @@
               <a:graphicData uri="http://schemas.openxmlformats.org/drawingml/2006/picture">
                 <pic:pic>
                   <pic:nvPicPr>
-                    <pic:cNvPr descr="/tmp/docximg-WFrKis/catalog_md_8.png" id="55" name="Picture"/>
+                    <pic:cNvPr descr="/tmp/docximg-ETXryJ/catalog_md_8.png" id="55" name="Picture"/>
                     <pic:cNvPicPr>
                       <a:picLocks noChangeArrowheads="1" noChangeAspect="1"/>
                     </pic:cNvPicPr>
@@ -6944,7 +6944,7 @@
               <a:graphicData uri="http://schemas.openxmlformats.org/drawingml/2006/picture">
                 <pic:pic>
                   <pic:nvPicPr>
-                    <pic:cNvPr descr="/tmp/docximg-WFrKis/catalog_md_9.png" id="58" name="Picture"/>
+                    <pic:cNvPr descr="/tmp/docximg-ETXryJ/catalog_md_9.png" id="58" name="Picture"/>
                     <pic:cNvPicPr>
                       <a:picLocks noChangeArrowheads="1" noChangeAspect="1"/>
                     </pic:cNvPicPr>
@@ -17841,7 +17841,7 @@
               <a:graphicData uri="http://schemas.openxmlformats.org/drawingml/2006/picture">
                 <pic:pic>
                   <pic:nvPicPr>
-                    <pic:cNvPr descr="/tmp/docximg-WFrKis/catalog_md_10.png" id="65" name="Picture"/>
+                    <pic:cNvPr descr="/tmp/docximg-ETXryJ/catalog_md_10.png" id="65" name="Picture"/>
                     <pic:cNvPicPr>
                       <a:picLocks noChangeArrowheads="1" noChangeAspect="1"/>
                     </pic:cNvPicPr>
@@ -30111,6 +30111,186 @@
       <w:r>
         <w:t xml:space="preserve">; the packages are these rows.</w:t>
       </w:r>
+      <w:r>
+        <w:t xml:space="preserve"> </w:t>
+      </w:r>
+      <w:r>
+        <w:rPr>
+          <w:bCs/>
+          <w:b/>
+        </w:rPr>
+        <w:t xml:space="preserve">Note on</w:t>
+      </w:r>
+      <w:r>
+        <w:rPr>
+          <w:bCs/>
+          <w:b/>
+        </w:rPr>
+        <w:t xml:space="preserve"> </w:t>
+      </w:r>
+      <w:r>
+        <w:rPr>
+          <w:rStyle w:val="VerbatimChar"/>
+          <w:bCs/>
+          <w:b/>
+        </w:rPr>
+        <w:t xml:space="preserve">component_role</w:t>
+      </w:r>
+      <w:r>
+        <w:rPr>
+          <w:bCs/>
+          <w:b/>
+        </w:rPr>
+        <w:t xml:space="preserve">:</w:t>
+      </w:r>
+      <w:r>
+        <w:t xml:space="preserve"> </w:t>
+      </w:r>
+      <w:r>
+        <w:t xml:space="preserve">only</w:t>
+      </w:r>
+      <w:r>
+        <w:t xml:space="preserve"> </w:t>
+      </w:r>
+      <w:r>
+        <w:rPr>
+          <w:rStyle w:val="VerbatimChar"/>
+        </w:rPr>
+        <w:t xml:space="preserve">ADDON</w:t>
+      </w:r>
+      <w:r>
+        <w:t xml:space="preserve">/</w:t>
+      </w:r>
+      <w:r>
+        <w:rPr>
+          <w:rStyle w:val="VerbatimChar"/>
+        </w:rPr>
+        <w:t xml:space="preserve">PRIMARY</w:t>
+      </w:r>
+      <w:r>
+        <w:t xml:space="preserve"> </w:t>
+      </w:r>
+      <w:r>
+        <w:t xml:space="preserve">drive code — a bundle with an</w:t>
+      </w:r>
+      <w:r>
+        <w:t xml:space="preserve"> </w:t>
+      </w:r>
+      <w:r>
+        <w:rPr>
+          <w:rStyle w:val="VerbatimChar"/>
+        </w:rPr>
+        <w:t xml:space="preserve">ADDON</w:t>
+      </w:r>
+      <w:r>
+        <w:t xml:space="preserve"> </w:t>
+      </w:r>
+      <w:r>
+        <w:t xml:space="preserve">must have a</w:t>
+      </w:r>
+      <w:r>
+        <w:t xml:space="preserve"> </w:t>
+      </w:r>
+      <w:r>
+        <w:rPr>
+          <w:rStyle w:val="VerbatimChar"/>
+        </w:rPr>
+        <w:t xml:space="preserve">PRIMARY</w:t>
+      </w:r>
+      <w:r>
+        <w:t xml:space="preserve"> </w:t>
+      </w:r>
+      <w:r>
+        <w:t xml:space="preserve">(</w:t>
+      </w:r>
+      <w:r>
+        <w:rPr>
+          <w:rStyle w:val="VerbatimChar"/>
+        </w:rPr>
+        <w:t xml:space="preserve">assertPrimaryBeforeAddon</w:t>
+      </w:r>
+      <w:r>
+        <w:t xml:space="preserve"> </w:t>
+      </w:r>
+      <w:r>
+        <w:t xml:space="preserve">+ the</w:t>
+      </w:r>
+      <w:r>
+        <w:t xml:space="preserve"> </w:t>
+      </w:r>
+      <w:r>
+        <w:rPr>
+          <w:rStyle w:val="VerbatimChar"/>
+        </w:rPr>
+        <w:t xml:space="preserve">PRIMARY_PRESENT</w:t>
+      </w:r>
+      <w:r>
+        <w:t xml:space="preserve"> </w:t>
+      </w:r>
+      <w:r>
+        <w:t xml:space="preserve">launch check).</w:t>
+      </w:r>
+      <w:r>
+        <w:t xml:space="preserve"> </w:t>
+      </w:r>
+      <w:r>
+        <w:rPr>
+          <w:rStyle w:val="VerbatimChar"/>
+        </w:rPr>
+        <w:t xml:space="preserve">OPTIONAL</w:t>
+      </w:r>
+      <w:r>
+        <w:t xml:space="preserve"> </w:t>
+      </w:r>
+      <w:r>
+        <w:t xml:space="preserve">and</w:t>
+      </w:r>
+      <w:r>
+        <w:t xml:space="preserve"> </w:t>
+      </w:r>
+      <w:r>
+        <w:rPr>
+          <w:rStyle w:val="VerbatimChar"/>
+        </w:rPr>
+        <w:t xml:space="preserve">PROMOTIONAL</w:t>
+      </w:r>
+      <w:r>
+        <w:t xml:space="preserve"> </w:t>
+      </w:r>
+      <w:r>
+        <w:t xml:space="preserve">are valid</w:t>
+      </w:r>
+      <w:r>
+        <w:t xml:space="preserve"> </w:t>
+      </w:r>
+      <w:r>
+        <w:rPr>
+          <w:bCs/>
+          <w:b/>
+        </w:rPr>
+        <w:t xml:space="preserve">descriptive labels</w:t>
+      </w:r>
+      <w:r>
+        <w:t xml:space="preserve"> </w:t>
+      </w:r>
+      <w:r>
+        <w:t xml:space="preserve">with no special behaviour today.</w:t>
+      </w:r>
+      <w:r>
+        <w:t xml:space="preserve"> </w:t>
+      </w:r>
+      <w:r>
+        <w:rPr>
+          <w:rStyle w:val="VerbatimChar"/>
+        </w:rPr>
+        <w:t xml:space="preserve">metadata_json</w:t>
+      </w:r>
+      <w:r>
+        <w:t xml:space="preserve"> </w:t>
+      </w:r>
+      <w:r>
+        <w:t xml:space="preserve">is a free-form operator blob (no fixed fields).</w:t>
+      </w:r>
     </w:p>
     <w:p>
       <w:pPr>
@@ -31041,31 +31221,13 @@
         <w:rPr>
           <w:rStyle w:val="FunctionTok"/>
         </w:rPr>
-        <w:t xml:space="preserve">:{</w:t>
-      </w:r>
-      <w:r>
-        <w:rPr>
-          <w:rStyle w:val="DataTypeTok"/>
-        </w:rPr>
-        <w:t xml:space="preserve">"promoMonths"</w:t>
-      </w:r>
-      <w:r>
-        <w:rPr>
-          <w:rStyle w:val="FunctionTok"/>
-        </w:rPr>
-        <w:t xml:space="preserve">:</w:t>
-      </w:r>
-      <w:r>
-        <w:rPr>
-          <w:rStyle w:val="DecValTok"/>
-        </w:rPr>
-        <w:t xml:space="preserve">3</w:t>
-      </w:r>
-      <w:r>
-        <w:rPr>
-          <w:rStyle w:val="FunctionTok"/>
-        </w:rPr>
-        <w:t xml:space="preserve">}</w:t>
+        <w:t xml:space="preserve">:</w:t>
+      </w:r>
+      <w:r>
+        <w:rPr>
+          <w:rStyle w:val="KeywordTok"/>
+        </w:rPr>
+        <w:t xml:space="preserve">null</w:t>
       </w:r>
       <w:r>
         <w:rPr>
@@ -31282,7 +31444,7 @@
               <w:jc w:val="left"/>
             </w:pPr>
             <w:r>
-              <w:t xml:space="preserve">The same bundle also offers a</w:t>
+              <w:t xml:space="preserve">The same bundle also offers</w:t>
             </w:r>
             <w:r>
               <w:t xml:space="preserve"> </w:t>
@@ -31307,7 +31469,7 @@
                 <w:bCs/>
                 <w:b/>
               </w:rPr>
-              <w:t xml:space="preserve">optional ADD-ON</w:t>
+              <w:t xml:space="preserve">ADD-ON</w:t>
             </w:r>
             <w:r>
               <w:t xml:space="preserve"> </w:t>
@@ -31322,7 +31484,59 @@
               <w:t xml:space="preserve">mandatory=false</w:t>
             </w:r>
             <w:r>
-              <w:t xml:space="preserve">); no pinned version, so it takes the package's current one.</w:t>
+              <w:t xml:space="preserve">), with</w:t>
+            </w:r>
+            <w:r>
+              <w:t xml:space="preserve"> </w:t>
+            </w:r>
+            <w:r>
+              <w:rPr>
+                <w:bCs/>
+                <w:b/>
+              </w:rPr>
+              <w:t xml:space="preserve">no version pinned</w:t>
+            </w:r>
+            <w:r>
+              <w:t xml:space="preserve"> </w:t>
+            </w:r>
+            <w:r>
+              <w:t xml:space="preserve">(</w:t>
+            </w:r>
+            <w:r>
+              <w:rPr>
+                <w:rStyle w:val="VerbatimChar"/>
+              </w:rPr>
+              <w:t xml:space="preserve">package_version_id=null</w:t>
+            </w:r>
+            <w:r>
+              <w:t xml:space="preserve">). Because there's an</w:t>
+            </w:r>
+            <w:r>
+              <w:t xml:space="preserve"> </w:t>
+            </w:r>
+            <w:r>
+              <w:rPr>
+                <w:rStyle w:val="VerbatimChar"/>
+              </w:rPr>
+              <w:t xml:space="preserve">ADDON</w:t>
+            </w:r>
+            <w:r>
+              <w:t xml:space="preserve">, the bundle must also have a</w:t>
+            </w:r>
+            <w:r>
+              <w:t xml:space="preserve"> </w:t>
+            </w:r>
+            <w:r>
+              <w:rPr>
+                <w:rStyle w:val="VerbatimChar"/>
+              </w:rPr>
+              <w:t xml:space="preserve">PRIMARY</w:t>
+            </w:r>
+            <w:r>
+              <w:t xml:space="preserve"> </w:t>
+            </w:r>
+            <w:r>
+              <w:t xml:space="preserve">(it does — bcomp_1).</w:t>
             </w:r>
           </w:p>
         </w:tc>
@@ -31412,7 +31626,7 @@
               <w:jc w:val="left"/>
             </w:pPr>
             <w:r>
-              <w:t xml:space="preserve">The Winback bundle bundles</w:t>
+              <w:t xml:space="preserve">The Winback bundle includes</w:t>
             </w:r>
             <w:r>
               <w:t xml:space="preserve"> </w:t>
@@ -31427,7 +31641,7 @@
               <w:t xml:space="preserve"> </w:t>
             </w:r>
             <w:r>
-              <w:t xml:space="preserve">as a</w:t>
+              <w:t xml:space="preserve">tagged</w:t>
             </w:r>
             <w:r>
               <w:t xml:space="preserve"> </w:t>
@@ -31442,16 +31656,33 @@
               <w:t xml:space="preserve"> </w:t>
             </w:r>
             <w:r>
-              <w:t xml:space="preserve">component, with a 3-month promo flag in</w:t>
+              <w:t xml:space="preserve">(a</w:t>
             </w:r>
             <w:r>
               <w:t xml:space="preserve"> </w:t>
             </w:r>
             <w:r>
               <w:rPr>
-                <w:rStyle w:val="VerbatimChar"/>
+                <w:bCs/>
+                <w:b/>
               </w:rPr>
-              <w:t xml:space="preserve">metadata_json</w:t>
+              <w:t xml:space="preserve">descriptive label only</w:t>
+            </w:r>
+            <w:r>
+              <w:t xml:space="preserve"> </w:t>
+            </w:r>
+            <w:r>
+              <w:t xml:space="preserve">— no special code behaviour), with</w:t>
+            </w:r>
+            <w:r>
+              <w:t xml:space="preserve"> </w:t>
+            </w:r>
+            <w:r>
+              <w:rPr>
+                <w:bCs/>
+                <w:b/>
+              </w:rPr>
+              <w:t xml:space="preserve">no version pinned</w:t>
             </w:r>
             <w:r>
               <w:t xml:space="preserve">.</w:t>
@@ -31514,13 +31745,31 @@
         <w:t xml:space="preserve"> </w:t>
       </w:r>
       <w:r>
+        <w:rPr>
+          <w:bCs/>
+          <w:b/>
+        </w:rPr>
         <w:t xml:space="preserve">pins a</w:t>
       </w:r>
       <w:r>
-        <w:t xml:space="preserve"> </w:t>
-      </w:r>
-      <w:r>
-        <w:t xml:space="preserve">version (null = the package's current one);</w:t>
+        <w:rPr>
+          <w:bCs/>
+          <w:b/>
+        </w:rPr>
+        <w:t xml:space="preserve"> </w:t>
+      </w:r>
+      <w:r>
+        <w:rPr>
+          <w:bCs/>
+          <w:b/>
+        </w:rPr>
+        <w:t xml:space="preserve">specific version, or null = not pinned</w:t>
+      </w:r>
+      <w:r>
+        <w:t xml:space="preserve"> </w:t>
+      </w:r>
+      <w:r>
+        <w:t xml:space="preserve">(just the package);</w:t>
       </w:r>
       <w:r>
         <w:t xml:space="preserve"> </w:t>
@@ -31532,7 +31781,32 @@
         <w:t xml:space="preserve">component_role</w:t>
       </w:r>
       <w:r>
-        <w:t xml:space="preserve">/</w:t>
+        <w:t xml:space="preserve"> </w:t>
+      </w:r>
+      <w:r>
+        <w:t xml:space="preserve">is mostly descriptive — the</w:t>
+      </w:r>
+      <w:r>
+        <w:t xml:space="preserve"> </w:t>
+      </w:r>
+      <w:r>
+        <w:t xml:space="preserve">one rule the engine enforces is</w:t>
+      </w:r>
+      <w:r>
+        <w:t xml:space="preserve"> </w:t>
+      </w:r>
+      <w:r>
+        <w:rPr>
+          <w:bCs/>
+          <w:b/>
+        </w:rPr>
+        <w:t xml:space="preserve">ADDON ⇒ needs a PRIMARY</w:t>
+      </w:r>
+      <w:r>
+        <w:t xml:space="preserve">;</w:t>
+      </w:r>
+      <w:r>
+        <w:t xml:space="preserve"> </w:t>
       </w:r>
       <w:r>
         <w:rPr>
@@ -31544,13 +31818,7 @@
         <w:t xml:space="preserve"> </w:t>
       </w:r>
       <w:r>
-        <w:t xml:space="preserve">say whether it's the core offer</w:t>
-      </w:r>
-      <w:r>
-        <w:t xml:space="preserve"> </w:t>
-      </w:r>
-      <w:r>
-        <w:t xml:space="preserve">or an optional add-on;</w:t>
+        <w:t xml:space="preserve">marks must-have vs optional;</w:t>
       </w:r>
       <w:r>
         <w:t xml:space="preserve"> </w:t>

</xml_diff>

<commit_message>
docs: regenerate rendered + docx after adding missing readings
Co-Authored-By: Claude Opus 4.8 <noreply@anthropic.com>
Claude-Session: https://claude.ai/code/session_01RwtMRFwzHC7G5CTnGLhgKu
</commit_message>
<xml_diff>
--- a/docs/as-built/docx/catalog.docx
+++ b/docs/as-built/docx/catalog.docx
@@ -1011,7 +1011,7 @@
               <a:graphicData uri="http://schemas.openxmlformats.org/drawingml/2006/picture">
                 <pic:pic>
                   <pic:nvPicPr>
-                    <pic:cNvPr descr="/tmp/docximg-xH1Dc7/catalog_md_1.png" id="23" name="Picture"/>
+                    <pic:cNvPr descr="/tmp/docximg-AYCofU/catalog_md_1.png" id="23" name="Picture"/>
                     <pic:cNvPicPr>
                       <a:picLocks noChangeArrowheads="1" noChangeAspect="1"/>
                     </pic:cNvPicPr>
@@ -1066,7 +1066,7 @@
               <a:graphicData uri="http://schemas.openxmlformats.org/drawingml/2006/picture">
                 <pic:pic>
                   <pic:nvPicPr>
-                    <pic:cNvPr descr="/tmp/docximg-xH1Dc7/catalog_md_2.png" id="26" name="Picture"/>
+                    <pic:cNvPr descr="/tmp/docximg-AYCofU/catalog_md_2.png" id="26" name="Picture"/>
                     <pic:cNvPicPr>
                       <a:picLocks noChangeArrowheads="1" noChangeAspect="1"/>
                     </pic:cNvPicPr>
@@ -1750,7 +1750,7 @@
               <a:graphicData uri="http://schemas.openxmlformats.org/drawingml/2006/picture">
                 <pic:pic>
                   <pic:nvPicPr>
-                    <pic:cNvPr descr="/tmp/docximg-xH1Dc7/catalog_md_3.png" id="31" name="Picture"/>
+                    <pic:cNvPr descr="/tmp/docximg-AYCofU/catalog_md_3.png" id="31" name="Picture"/>
                     <pic:cNvPicPr>
                       <a:picLocks noChangeArrowheads="1" noChangeAspect="1"/>
                     </pic:cNvPicPr>
@@ -2381,7 +2381,7 @@
               <a:graphicData uri="http://schemas.openxmlformats.org/drawingml/2006/picture">
                 <pic:pic>
                   <pic:nvPicPr>
-                    <pic:cNvPr descr="/tmp/docximg-xH1Dc7/catalog_md_4.png" id="36" name="Picture"/>
+                    <pic:cNvPr descr="/tmp/docximg-AYCofU/catalog_md_4.png" id="36" name="Picture"/>
                     <pic:cNvPicPr>
                       <a:picLocks noChangeArrowheads="1" noChangeAspect="1"/>
                     </pic:cNvPicPr>
@@ -2870,7 +2870,7 @@
               <a:graphicData uri="http://schemas.openxmlformats.org/drawingml/2006/picture">
                 <pic:pic>
                   <pic:nvPicPr>
-                    <pic:cNvPr descr="/tmp/docximg-xH1Dc7/catalog_md_5.png" id="40" name="Picture"/>
+                    <pic:cNvPr descr="/tmp/docximg-AYCofU/catalog_md_5.png" id="40" name="Picture"/>
                     <pic:cNvPicPr>
                       <a:picLocks noChangeArrowheads="1" noChangeAspect="1"/>
                     </pic:cNvPicPr>
@@ -3073,7 +3073,7 @@
               <a:graphicData uri="http://schemas.openxmlformats.org/drawingml/2006/picture">
                 <pic:pic>
                   <pic:nvPicPr>
-                    <pic:cNvPr descr="/tmp/docximg-xH1Dc7/catalog_md_6.png" id="44" name="Picture"/>
+                    <pic:cNvPr descr="/tmp/docximg-AYCofU/catalog_md_6.png" id="44" name="Picture"/>
                     <pic:cNvPicPr>
                       <a:picLocks noChangeArrowheads="1" noChangeAspect="1"/>
                     </pic:cNvPicPr>
@@ -3650,7 +3650,7 @@
               <a:graphicData uri="http://schemas.openxmlformats.org/drawingml/2006/picture">
                 <pic:pic>
                   <pic:nvPicPr>
-                    <pic:cNvPr descr="/tmp/docximg-xH1Dc7/catalog_md_7.png" id="49" name="Picture"/>
+                    <pic:cNvPr descr="/tmp/docximg-AYCofU/catalog_md_7.png" id="49" name="Picture"/>
                     <pic:cNvPicPr>
                       <a:picLocks noChangeArrowheads="1" noChangeAspect="1"/>
                     </pic:cNvPicPr>
@@ -6864,7 +6864,7 @@
               <a:graphicData uri="http://schemas.openxmlformats.org/drawingml/2006/picture">
                 <pic:pic>
                   <pic:nvPicPr>
-                    <pic:cNvPr descr="/tmp/docximg-xH1Dc7/catalog_md_8.png" id="55" name="Picture"/>
+                    <pic:cNvPr descr="/tmp/docximg-AYCofU/catalog_md_8.png" id="55" name="Picture"/>
                     <pic:cNvPicPr>
                       <a:picLocks noChangeArrowheads="1" noChangeAspect="1"/>
                     </pic:cNvPicPr>
@@ -6944,7 +6944,7 @@
               <a:graphicData uri="http://schemas.openxmlformats.org/drawingml/2006/picture">
                 <pic:pic>
                   <pic:nvPicPr>
-                    <pic:cNvPr descr="/tmp/docximg-xH1Dc7/catalog_md_9.png" id="58" name="Picture"/>
+                    <pic:cNvPr descr="/tmp/docximg-AYCofU/catalog_md_9.png" id="58" name="Picture"/>
                     <pic:cNvPicPr>
                       <a:picLocks noChangeArrowheads="1" noChangeAspect="1"/>
                     </pic:cNvPicPr>
@@ -10763,6 +10763,628 @@
           <w:rStyle w:val="FunctionTok"/>
         </w:rPr>
         <w:t xml:space="preserve">}</w:t>
+      </w:r>
+    </w:p>
+    <w:p>
+      <w:pPr>
+        <w:pStyle w:val="FirstParagraph"/>
+      </w:pPr>
+      <w:r>
+        <w:rPr>
+          <w:bCs/>
+          <w:b/>
+        </w:rPr>
+        <w:t xml:space="preserve">Read each row as a sentence —</w:t>
+      </w:r>
+      <w:r>
+        <w:rPr>
+          <w:bCs/>
+          <w:b/>
+        </w:rPr>
+        <w:t xml:space="preserve"> </w:t>
+      </w:r>
+      <w:r>
+        <w:rPr>
+          <w:iCs/>
+          <w:i/>
+          <w:bCs/>
+          <w:b/>
+        </w:rPr>
+        <w:t xml:space="preserve">this data means this:</w:t>
+      </w:r>
+    </w:p>
+    <w:tbl>
+      <w:tblPr>
+        <w:tblStyle w:val="Table"/>
+        <w:tblW w:type="auto" w:w="0"/>
+        <w:tblLook w:firstRow="1" w:lastRow="0" w:firstColumn="0" w:lastColumn="0" w:noHBand="0" w:noVBand="0" w:val="0020"/>
+        <w:jc w:val="start"/>
+      </w:tblPr>
+      <w:tblGrid>
+        <w:gridCol w:w="3960"/>
+        <w:gridCol w:w="3960"/>
+      </w:tblGrid>
+      <w:tr>
+        <w:trPr>
+          <w:tblHeader w:val="true"/>
+        </w:trPr>
+        <w:tc>
+          <w:tcPr/>
+          <w:p>
+            <w:pPr>
+              <w:pStyle w:val="Compact"/>
+              <w:jc w:val="left"/>
+            </w:pPr>
+            <w:r>
+              <w:t xml:space="preserve">Row</w:t>
+            </w:r>
+          </w:p>
+        </w:tc>
+        <w:tc>
+          <w:tcPr/>
+          <w:p>
+            <w:pPr>
+              <w:pStyle w:val="Compact"/>
+              <w:jc w:val="left"/>
+            </w:pPr>
+            <w:r>
+              <w:t xml:space="preserve">What it means in plain English</w:t>
+            </w:r>
+          </w:p>
+        </w:tc>
+      </w:tr>
+      <w:tr>
+        <w:tc>
+          <w:tcPr/>
+          <w:p>
+            <w:pPr>
+              <w:pStyle w:val="Compact"/>
+              <w:jc w:val="left"/>
+            </w:pPr>
+            <w:r>
+              <w:rPr>
+                <w:bCs/>
+                <w:b/>
+              </w:rPr>
+              <w:t xml:space="preserve">disc_ret25</w:t>
+            </w:r>
+          </w:p>
+        </w:tc>
+        <w:tc>
+          <w:tcPr/>
+          <w:p>
+            <w:pPr>
+              <w:pStyle w:val="Compact"/>
+              <w:jc w:val="left"/>
+            </w:pPr>
+            <w:r>
+              <w:t xml:space="preserve">A</w:t>
+            </w:r>
+            <w:r>
+              <w:t xml:space="preserve"> </w:t>
+            </w:r>
+            <w:r>
+              <w:rPr>
+                <w:bCs/>
+                <w:b/>
+              </w:rPr>
+              <w:t xml:space="preserve">25%-off</w:t>
+            </w:r>
+            <w:r>
+              <w:t xml:space="preserve"> </w:t>
+            </w:r>
+            <w:r>
+              <w:t xml:space="preserve">rule (</w:t>
+            </w:r>
+            <w:r>
+              <w:rPr>
+                <w:rStyle w:val="VerbatimChar"/>
+              </w:rPr>
+              <w:t xml:space="preserve">discount_type=PERCENT</w:t>
+            </w:r>
+            <w:r>
+              <w:t xml:space="preserve">,</w:t>
+            </w:r>
+            <w:r>
+              <w:t xml:space="preserve"> </w:t>
+            </w:r>
+            <w:r>
+              <w:rPr>
+                <w:rStyle w:val="VerbatimChar"/>
+              </w:rPr>
+              <w:t xml:space="preserve">value=0.25</w:t>
+            </w:r>
+            <w:r>
+              <w:t xml:space="preserve">) applied to the</w:t>
+            </w:r>
+            <w:r>
+              <w:t xml:space="preserve"> </w:t>
+            </w:r>
+            <w:r>
+              <w:rPr>
+                <w:bCs/>
+                <w:b/>
+              </w:rPr>
+              <w:t xml:space="preserve">whole invoice</w:t>
+            </w:r>
+            <w:r>
+              <w:t xml:space="preserve"> </w:t>
+            </w:r>
+            <w:r>
+              <w:t xml:space="preserve">(</w:t>
+            </w:r>
+            <w:r>
+              <w:rPr>
+                <w:rStyle w:val="VerbatimChar"/>
+              </w:rPr>
+              <w:t xml:space="preserve">applies_to=INVOICE</w:t>
+            </w:r>
+            <w:r>
+              <w:t xml:space="preserve">);</w:t>
+            </w:r>
+            <w:r>
+              <w:t xml:space="preserve"> </w:t>
+            </w:r>
+            <w:r>
+              <w:rPr>
+                <w:bCs/>
+                <w:b/>
+              </w:rPr>
+              <w:t xml:space="preserve">non-stackable</w:t>
+            </w:r>
+            <w:r>
+              <w:t xml:space="preserve"> </w:t>
+            </w:r>
+            <w:r>
+              <w:t xml:space="preserve">(</w:t>
+            </w:r>
+            <w:r>
+              <w:rPr>
+                <w:rStyle w:val="VerbatimChar"/>
+              </w:rPr>
+              <w:t xml:space="preserve">stackable=false</w:t>
+            </w:r>
+            <w:r>
+              <w:t xml:space="preserve">) and unlimited (</w:t>
+            </w:r>
+            <w:r>
+              <w:rPr>
+                <w:rStyle w:val="VerbatimChar"/>
+              </w:rPr>
+              <w:t xml:space="preserve">max_redemptions=null</w:t>
+            </w:r>
+            <w:r>
+              <w:t xml:space="preserve">).</w:t>
+            </w:r>
+          </w:p>
+        </w:tc>
+      </w:tr>
+      <w:tr>
+        <w:tc>
+          <w:tcPr/>
+          <w:p>
+            <w:pPr>
+              <w:pStyle w:val="Compact"/>
+              <w:jc w:val="left"/>
+            </w:pPr>
+            <w:r>
+              <w:rPr>
+                <w:bCs/>
+                <w:b/>
+              </w:rPr>
+              <w:t xml:space="preserve">disc_wel500</w:t>
+            </w:r>
+          </w:p>
+        </w:tc>
+        <w:tc>
+          <w:tcPr/>
+          <w:p>
+            <w:pPr>
+              <w:pStyle w:val="Compact"/>
+              <w:jc w:val="left"/>
+            </w:pPr>
+            <w:r>
+              <w:t xml:space="preserve">A</w:t>
+            </w:r>
+            <w:r>
+              <w:t xml:space="preserve"> </w:t>
+            </w:r>
+            <w:r>
+              <w:rPr>
+                <w:bCs/>
+                <w:b/>
+              </w:rPr>
+              <w:t xml:space="preserve">flat KES 500-off</w:t>
+            </w:r>
+            <w:r>
+              <w:t xml:space="preserve"> </w:t>
+            </w:r>
+            <w:r>
+              <w:t xml:space="preserve">rule (</w:t>
+            </w:r>
+            <w:r>
+              <w:rPr>
+                <w:rStyle w:val="VerbatimChar"/>
+              </w:rPr>
+              <w:t xml:space="preserve">discount_type=FIXED</w:t>
+            </w:r>
+            <w:r>
+              <w:t xml:space="preserve">,</w:t>
+            </w:r>
+            <w:r>
+              <w:t xml:space="preserve"> </w:t>
+            </w:r>
+            <w:r>
+              <w:rPr>
+                <w:rStyle w:val="VerbatimChar"/>
+              </w:rPr>
+              <w:t xml:space="preserve">value=500</w:t>
+            </w:r>
+            <w:r>
+              <w:t xml:space="preserve">);</w:t>
+            </w:r>
+            <w:r>
+              <w:t xml:space="preserve"> </w:t>
+            </w:r>
+            <w:r>
+              <w:rPr>
+                <w:bCs/>
+                <w:b/>
+              </w:rPr>
+              <w:t xml:space="preserve">stackable</w:t>
+            </w:r>
+            <w:r>
+              <w:t xml:space="preserve"> </w:t>
+            </w:r>
+            <w:r>
+              <w:t xml:space="preserve">and</w:t>
+            </w:r>
+            <w:r>
+              <w:t xml:space="preserve"> </w:t>
+            </w:r>
+            <w:r>
+              <w:rPr>
+                <w:bCs/>
+                <w:b/>
+              </w:rPr>
+              <w:t xml:space="preserve">single-use</w:t>
+            </w:r>
+            <w:r>
+              <w:t xml:space="preserve"> </w:t>
+            </w:r>
+            <w:r>
+              <w:t xml:space="preserve">(</w:t>
+            </w:r>
+            <w:r>
+              <w:rPr>
+                <w:rStyle w:val="VerbatimChar"/>
+              </w:rPr>
+              <w:t xml:space="preserve">max_redemptions=1</w:t>
+            </w:r>
+            <w:r>
+              <w:t xml:space="preserve">).</w:t>
+            </w:r>
+          </w:p>
+        </w:tc>
+      </w:tr>
+      <w:tr>
+        <w:tc>
+          <w:tcPr/>
+          <w:p>
+            <w:pPr>
+              <w:pStyle w:val="Compact"/>
+              <w:jc w:val="left"/>
+            </w:pPr>
+            <w:r>
+              <w:rPr>
+                <w:bCs/>
+                <w:b/>
+              </w:rPr>
+              <w:t xml:space="preserve">disc_staff</w:t>
+            </w:r>
+          </w:p>
+        </w:tc>
+        <w:tc>
+          <w:tcPr/>
+          <w:p>
+            <w:pPr>
+              <w:pStyle w:val="Compact"/>
+              <w:jc w:val="left"/>
+            </w:pPr>
+            <w:r>
+              <w:t xml:space="preserve">A</w:t>
+            </w:r>
+            <w:r>
+              <w:t xml:space="preserve"> </w:t>
+            </w:r>
+            <w:r>
+              <w:rPr>
+                <w:bCs/>
+                <w:b/>
+              </w:rPr>
+              <w:t xml:space="preserve">50%-off</w:t>
+            </w:r>
+            <w:r>
+              <w:t xml:space="preserve"> </w:t>
+            </w:r>
+            <w:r>
+              <w:t xml:space="preserve">rule applied to a</w:t>
+            </w:r>
+            <w:r>
+              <w:t xml:space="preserve"> </w:t>
+            </w:r>
+            <w:r>
+              <w:rPr>
+                <w:bCs/>
+                <w:b/>
+              </w:rPr>
+              <w:t xml:space="preserve">package</w:t>
+            </w:r>
+            <w:r>
+              <w:t xml:space="preserve"> </w:t>
+            </w:r>
+            <w:r>
+              <w:t xml:space="preserve">(</w:t>
+            </w:r>
+            <w:r>
+              <w:rPr>
+                <w:rStyle w:val="VerbatimChar"/>
+              </w:rPr>
+              <w:t xml:space="preserve">applies_to=PACKAGE</w:t>
+            </w:r>
+            <w:r>
+              <w:t xml:space="preserve">), highest combine priority (</w:t>
+            </w:r>
+            <w:r>
+              <w:rPr>
+                <w:rStyle w:val="VerbatimChar"/>
+              </w:rPr>
+              <w:t xml:space="preserve">priority=10</w:t>
+            </w:r>
+            <w:r>
+              <w:t xml:space="preserve"> </w:t>
+            </w:r>
+            <w:r>
+              <w:t xml:space="preserve">— lower wins).</w:t>
+            </w:r>
+          </w:p>
+        </w:tc>
+      </w:tr>
+      <w:tr>
+        <w:tc>
+          <w:tcPr/>
+          <w:p>
+            <w:pPr>
+              <w:pStyle w:val="Compact"/>
+              <w:jc w:val="left"/>
+            </w:pPr>
+            <w:r>
+              <w:rPr>
+                <w:bCs/>
+                <w:b/>
+              </w:rPr>
+              <w:t xml:space="preserve">disc_old</w:t>
+            </w:r>
+          </w:p>
+        </w:tc>
+        <w:tc>
+          <w:tcPr/>
+          <w:p>
+            <w:pPr>
+              <w:pStyle w:val="Compact"/>
+              <w:jc w:val="left"/>
+            </w:pPr>
+            <w:r>
+              <w:t xml:space="preserve">An expired launch discount —</w:t>
+            </w:r>
+            <w:r>
+              <w:t xml:space="preserve"> </w:t>
+            </w:r>
+            <w:r>
+              <w:rPr>
+                <w:bCs/>
+                <w:b/>
+              </w:rPr>
+              <w:t xml:space="preserve">switched off</w:t>
+            </w:r>
+            <w:r>
+              <w:t xml:space="preserve"> </w:t>
+            </w:r>
+            <w:r>
+              <w:t xml:space="preserve">(</w:t>
+            </w:r>
+            <w:r>
+              <w:rPr>
+                <w:rStyle w:val="VerbatimChar"/>
+              </w:rPr>
+              <w:t xml:space="preserve">status=INACTIVE</w:t>
+            </w:r>
+            <w:r>
+              <w:t xml:space="preserve">) and past its</w:t>
+            </w:r>
+            <w:r>
+              <w:t xml:space="preserve"> </w:t>
+            </w:r>
+            <w:r>
+              <w:rPr>
+                <w:rStyle w:val="VerbatimChar"/>
+              </w:rPr>
+              <w:t xml:space="preserve">effective_until</w:t>
+            </w:r>
+            <w:r>
+              <w:t xml:space="preserve">, so it never applies.</w:t>
+            </w:r>
+          </w:p>
+        </w:tc>
+      </w:tr>
+    </w:tbl>
+    <w:p>
+      <w:pPr>
+        <w:pStyle w:val="BodyText"/>
+      </w:pPr>
+      <w:r>
+        <w:rPr>
+          <w:bCs/>
+          <w:b/>
+        </w:rPr>
+        <w:t xml:space="preserve">The columns that did the work:</w:t>
+      </w:r>
+      <w:r>
+        <w:t xml:space="preserve"> </w:t>
+      </w:r>
+      <w:r>
+        <w:rPr>
+          <w:rStyle w:val="VerbatimChar"/>
+        </w:rPr>
+        <w:t xml:space="preserve">discount_type</w:t>
+      </w:r>
+      <w:r>
+        <w:t xml:space="preserve">+</w:t>
+      </w:r>
+      <w:r>
+        <w:rPr>
+          <w:rStyle w:val="VerbatimChar"/>
+        </w:rPr>
+        <w:t xml:space="preserve">value</w:t>
+      </w:r>
+      <w:r>
+        <w:t xml:space="preserve"> </w:t>
+      </w:r>
+      <w:r>
+        <w:t xml:space="preserve">are the maths (percent fraction vs fixed amount);</w:t>
+      </w:r>
+      <w:r>
+        <w:t xml:space="preserve"> </w:t>
+      </w:r>
+      <w:r>
+        <w:rPr>
+          <w:rStyle w:val="VerbatimChar"/>
+        </w:rPr>
+        <w:t xml:space="preserve">applies_to</w:t>
+      </w:r>
+      <w:r>
+        <w:t xml:space="preserve"> </w:t>
+      </w:r>
+      <w:r>
+        <w:t xml:space="preserve">is the target (invoice/package/service);</w:t>
+      </w:r>
+      <w:r>
+        <w:t xml:space="preserve"> </w:t>
+      </w:r>
+      <w:r>
+        <w:rPr>
+          <w:rStyle w:val="VerbatimChar"/>
+        </w:rPr>
+        <w:t xml:space="preserve">stackable</w:t>
+      </w:r>
+      <w:r>
+        <w:t xml:space="preserve">+</w:t>
+      </w:r>
+      <w:r>
+        <w:rPr>
+          <w:rStyle w:val="VerbatimChar"/>
+        </w:rPr>
+        <w:t xml:space="preserve">priority</w:t>
+      </w:r>
+      <w:r>
+        <w:t xml:space="preserve"> </w:t>
+      </w:r>
+      <w:r>
+        <w:t xml:space="preserve">decide how it combines with others (lower</w:t>
+      </w:r>
+      <w:r>
+        <w:t xml:space="preserve"> </w:t>
+      </w:r>
+      <w:r>
+        <w:rPr>
+          <w:rStyle w:val="VerbatimChar"/>
+        </w:rPr>
+        <w:t xml:space="preserve">priority</w:t>
+      </w:r>
+      <w:r>
+        <w:t xml:space="preserve"> </w:t>
+      </w:r>
+      <w:r>
+        <w:t xml:space="preserve">wins a tie);</w:t>
+      </w:r>
+      <w:r>
+        <w:t xml:space="preserve"> </w:t>
+      </w:r>
+      <w:r>
+        <w:rPr>
+          <w:rStyle w:val="VerbatimChar"/>
+        </w:rPr>
+        <w:t xml:space="preserve">max_redemptions</w:t>
+      </w:r>
+      <w:r>
+        <w:t xml:space="preserve"> </w:t>
+      </w:r>
+      <w:r>
+        <w:t xml:space="preserve">caps uses;</w:t>
+      </w:r>
+      <w:r>
+        <w:t xml:space="preserve"> </w:t>
+      </w:r>
+      <w:r>
+        <w:rPr>
+          <w:rStyle w:val="VerbatimChar"/>
+        </w:rPr>
+        <w:t xml:space="preserve">status</w:t>
+      </w:r>
+      <w:r>
+        <w:t xml:space="preserve">+</w:t>
+      </w:r>
+      <w:r>
+        <w:rPr>
+          <w:rStyle w:val="VerbatimChar"/>
+        </w:rPr>
+        <w:t xml:space="preserve">effective_from</w:t>
+      </w:r>
+      <w:r>
+        <w:t xml:space="preserve">/</w:t>
+      </w:r>
+      <w:r>
+        <w:rPr>
+          <w:rStyle w:val="VerbatimChar"/>
+        </w:rPr>
+        <w:t xml:space="preserve">until</w:t>
+      </w:r>
+      <w:r>
+        <w:t xml:space="preserve"> </w:t>
+      </w:r>
+      <w:r>
+        <w:t xml:space="preserve">gate whether it's live. (A live rule is</w:t>
+      </w:r>
+      <w:r>
+        <w:t xml:space="preserve"> </w:t>
+      </w:r>
+      <w:r>
+        <w:rPr>
+          <w:iCs/>
+          <w:i/>
+        </w:rPr>
+        <w:t xml:space="preserve">granted</w:t>
+      </w:r>
+      <w:r>
+        <w:t xml:space="preserve"> </w:t>
+      </w:r>
+      <w:r>
+        <w:t xml:space="preserve">to a customer via</w:t>
+      </w:r>
+      <w:r>
+        <w:t xml:space="preserve"> </w:t>
+      </w:r>
+      <w:r>
+        <w:rPr>
+          <w:rStyle w:val="VerbatimChar"/>
+        </w:rPr>
+        <w:t xml:space="preserve">discount_assignment</w:t>
+      </w:r>
+      <w:r>
+        <w:t xml:space="preserve"> </w:t>
+      </w:r>
+      <w:r>
+        <w:t xml:space="preserve">below.)</w:t>
       </w:r>
     </w:p>
     <w:bookmarkEnd w:id="61"/>
@@ -17829,7 +18451,7 @@
               <a:graphicData uri="http://schemas.openxmlformats.org/drawingml/2006/picture">
                 <pic:pic>
                   <pic:nvPicPr>
-                    <pic:cNvPr descr="/tmp/docximg-xH1Dc7/catalog_md_10.png" id="65" name="Picture"/>
+                    <pic:cNvPr descr="/tmp/docximg-AYCofU/catalog_md_10.png" id="65" name="Picture"/>
                     <pic:cNvPicPr>
                       <a:picLocks noChangeArrowheads="1" noChangeAspect="1"/>
                     </pic:cNvPicPr>

</xml_diff>